<commit_message>
upload perubahan template prapurna takeover docx
</commit_message>
<xml_diff>
--- a/template_prapurna_takeover.docx
+++ b/template_prapurna_takeover.docx
@@ -14,27 +14,27 @@
           <w:u w:val="single"/>
         </w:rPr>
       </w:pPr>
-      <w:bookmarkStart w:id="0" w:name="OLE_LINK62"/>
-      <w:bookmarkStart w:id="1" w:name="OLE_LINK28"/>
-      <w:bookmarkStart w:id="2" w:name="OLE_LINK66"/>
-      <w:bookmarkStart w:id="3" w:name="OLE_LINK38"/>
-      <w:bookmarkStart w:id="4" w:name="OLE_LINK55"/>
-      <w:bookmarkStart w:id="5" w:name="OLE_LINK5"/>
-      <w:bookmarkStart w:id="6" w:name="OLE_LINK51"/>
-      <w:bookmarkStart w:id="7" w:name="OLE_LINK29"/>
-      <w:bookmarkStart w:id="8" w:name="OLE_LINK67"/>
+      <w:bookmarkStart w:id="0" w:name="OLE_LINK28"/>
+      <w:bookmarkStart w:id="1" w:name="OLE_LINK55"/>
+      <w:bookmarkStart w:id="2" w:name="OLE_LINK38"/>
+      <w:bookmarkStart w:id="3" w:name="OLE_LINK62"/>
+      <w:bookmarkStart w:id="4" w:name="OLE_LINK66"/>
+      <w:bookmarkStart w:id="5" w:name="OLE_LINK29"/>
+      <w:bookmarkStart w:id="6" w:name="OLE_LINK5"/>
+      <w:bookmarkStart w:id="7" w:name="OLE_LINK51"/>
+      <w:bookmarkStart w:id="8" w:name="OLE_LINK3"/>
       <w:bookmarkStart w:id="9" w:name="OLE_LINK7"/>
       <w:bookmarkStart w:id="10" w:name="OLE_LINK17"/>
-      <w:bookmarkStart w:id="11" w:name="OLE_LINK87"/>
-      <w:bookmarkStart w:id="12" w:name="OLE_LINK56"/>
-      <w:bookmarkStart w:id="13" w:name="OLE_LINK36"/>
-      <w:bookmarkStart w:id="14" w:name="OLE_LINK37"/>
-      <w:bookmarkStart w:id="15" w:name="OLE_LINK49"/>
-      <w:bookmarkStart w:id="16" w:name="OLE_LINK3"/>
-      <w:bookmarkStart w:id="17" w:name="OLE_LINK44"/>
-      <w:bookmarkStart w:id="18" w:name="OLE_LINK8"/>
-      <w:bookmarkStart w:id="19" w:name="OLE_LINK48"/>
-      <w:bookmarkStart w:id="20" w:name="OLE_LINK89"/>
+      <w:bookmarkStart w:id="11" w:name="OLE_LINK56"/>
+      <w:bookmarkStart w:id="12" w:name="OLE_LINK37"/>
+      <w:bookmarkStart w:id="13" w:name="OLE_LINK44"/>
+      <w:bookmarkStart w:id="14" w:name="OLE_LINK89"/>
+      <w:bookmarkStart w:id="15" w:name="OLE_LINK48"/>
+      <w:bookmarkStart w:id="16" w:name="OLE_LINK87"/>
+      <w:bookmarkStart w:id="17" w:name="OLE_LINK67"/>
+      <w:bookmarkStart w:id="18" w:name="OLE_LINK36"/>
+      <w:bookmarkStart w:id="19" w:name="OLE_LINK49"/>
+      <w:bookmarkStart w:id="20" w:name="OLE_LINK8"/>
       <w:r>
         <w:rPr>
           <w:rFonts w:ascii="Kalinga" w:hAnsi="Kalinga" w:cs="Kalinga"/>
@@ -1595,23 +1595,13 @@
         </w:rPr>
       </w:pPr>
       <w:bookmarkStart w:id="21" w:name="OLE_LINK31"/>
-      <w:bookmarkStart w:id="55" w:name="_GoBack"/>
-      <w:r>
-        <w:rPr>
-          <w:rFonts w:hint="default" w:ascii="Kalinga" w:hAnsi="Kalinga"/>
-          <w:sz w:val="20"/>
-          <w:szCs w:val="20"/>
-        </w:rPr>
-        <w:t>Cfm. Estimasi Hak Pensiun nomor NIP</w:t>
-      </w:r>
-      <w:bookmarkEnd w:id="55"/>
-      <w:r>
-        <w:rPr>
-          <w:rFonts w:hint="default" w:ascii="Kalinga" w:hAnsi="Kalinga"/>
-          <w:sz w:val="20"/>
-          <w:szCs w:val="20"/>
-        </w:rPr>
-        <w:t xml:space="preserve"> {{ nip_pemohon | default('', true) }} atas nama {{ nama_pemohon | default('', true) }} dengan Hak Pensiun yang akan diterima +/- Rp. {{ estimasi_hak_pensiun | default('0', true) }},-</w:t>
+      <w:r>
+        <w:rPr>
+          <w:rFonts w:hint="default" w:ascii="Kalinga" w:hAnsi="Kalinga"/>
+          <w:sz w:val="20"/>
+          <w:szCs w:val="20"/>
+        </w:rPr>
+        <w:t>Cfm. Estimasi Hak Pensiun nomor NIP {{ nip_pemohon | default('', true) }} atas nama {{ nama_pemohon | default('', true) }} dengan Hak Pensiun yang akan diterima +/- Rp. {{ estimasi_hak_pensiun | default('0', true) }},-</w:t>
       </w:r>
       <w:r>
         <w:rPr>
@@ -1690,18 +1680,18 @@
       </w:pPr>
       <w:bookmarkStart w:id="22" w:name="OLE_LINK71"/>
       <w:bookmarkStart w:id="23" w:name="OLE_LINK63"/>
-      <w:bookmarkStart w:id="24" w:name="OLE_LINK61"/>
-      <w:bookmarkStart w:id="25" w:name="OLE_LINK21"/>
-      <w:bookmarkStart w:id="26" w:name="OLE_LINK54"/>
-      <w:bookmarkStart w:id="27" w:name="OLE_LINK90"/>
-      <w:bookmarkStart w:id="28" w:name="OLE_LINK68"/>
-      <w:bookmarkStart w:id="29" w:name="OLE_LINK73"/>
-      <w:bookmarkStart w:id="30" w:name="OLE_LINK20"/>
-      <w:bookmarkStart w:id="31" w:name="OLE_LINK10"/>
-      <w:bookmarkStart w:id="32" w:name="OLE_LINK45"/>
-      <w:bookmarkStart w:id="33" w:name="OLE_LINK39"/>
-      <w:bookmarkStart w:id="34" w:name="OLE_LINK88"/>
-      <w:bookmarkStart w:id="35" w:name="OLE_LINK52"/>
+      <w:bookmarkStart w:id="24" w:name="OLE_LINK39"/>
+      <w:bookmarkStart w:id="25" w:name="OLE_LINK88"/>
+      <w:bookmarkStart w:id="26" w:name="OLE_LINK52"/>
+      <w:bookmarkStart w:id="27" w:name="OLE_LINK73"/>
+      <w:bookmarkStart w:id="28" w:name="OLE_LINK21"/>
+      <w:bookmarkStart w:id="29" w:name="OLE_LINK45"/>
+      <w:bookmarkStart w:id="30" w:name="OLE_LINK54"/>
+      <w:bookmarkStart w:id="31" w:name="OLE_LINK68"/>
+      <w:bookmarkStart w:id="32" w:name="OLE_LINK20"/>
+      <w:bookmarkStart w:id="33" w:name="OLE_LINK61"/>
+      <w:bookmarkStart w:id="34" w:name="OLE_LINK90"/>
+      <w:bookmarkStart w:id="35" w:name="OLE_LINK10"/>
       <w:r>
         <w:rPr>
           <w:rFonts w:hint="default" w:ascii="Kalinga" w:hAnsi="Kalinga"/>
@@ -4948,8 +4938,8 @@
         </w:rPr>
       </w:pPr>
       <w:bookmarkStart w:id="41" w:name="OLE_LINK53"/>
-      <w:bookmarkStart w:id="42" w:name="OLE_LINK12"/>
-      <w:bookmarkStart w:id="43" w:name="OLE_LINK32"/>
+      <w:bookmarkStart w:id="42" w:name="OLE_LINK32"/>
+      <w:bookmarkStart w:id="43" w:name="OLE_LINK12"/>
       <w:bookmarkStart w:id="44" w:name="OLE_LINK57"/>
       <w:bookmarkStart w:id="45" w:name="OLE_LINK16"/>
       <w:r>
@@ -5200,542 +5190,17 @@
         <w:t xml:space="preserve">  </w:t>
       </w:r>
     </w:p>
-    <w:p>
-      <w:pPr>
-        <w:pStyle w:val="6"/>
-        <w:numPr>
-          <w:ilvl w:val="0"/>
-          <w:numId w:val="1"/>
-        </w:numPr>
-        <w:spacing w:line="240" w:lineRule="auto"/>
-        <w:ind w:left="360" w:leftChars="0" w:right="160" w:rightChars="0" w:hanging="280" w:firstLineChars="0"/>
-        <w:jc w:val="both"/>
-        <w:rPr>
-          <w:rFonts w:hint="default" w:ascii="Kalinga" w:hAnsi="Kalinga"/>
-          <w:sz w:val="20"/>
-          <w:szCs w:val="20"/>
-        </w:rPr>
-      </w:pPr>
-      <w:bookmarkStart w:id="46" w:name="OLE_LINK1"/>
-      <w:r>
-        <w:rPr>
-          <w:rFonts w:ascii="Kalinga" w:hAnsi="Kalinga" w:cs="Kalinga"/>
-          <w:sz w:val="20"/>
-          <w:szCs w:val="20"/>
-        </w:rPr>
-        <w:t>P</w:t>
-      </w:r>
-      <w:bookmarkEnd w:id="41"/>
-      <w:bookmarkEnd w:id="46"/>
-      <w:r>
-        <w:rPr>
-          <w:rFonts w:hint="default" w:ascii="Kalinga" w:hAnsi="Kalinga"/>
-          <w:sz w:val="20"/>
-          <w:szCs w:val="20"/>
-        </w:rPr>
-        <w:t>emohon wajib Membuka Rekening BNI Taplus sebagai Rekening Afiliasi BNI Fleksi Kredit Pensiun, dan wajib menjadi Rekening Penyaluran Manfaat Pensiun Pemohon.</w:t>
-      </w:r>
-    </w:p>
-    <w:p>
-      <w:pPr>
-        <w:pStyle w:val="6"/>
-        <w:numPr>
-          <w:ilvl w:val="0"/>
-          <w:numId w:val="1"/>
-        </w:numPr>
-        <w:spacing w:line="240" w:lineRule="auto"/>
-        <w:ind w:left="360" w:leftChars="0" w:right="160" w:rightChars="0" w:hanging="280" w:firstLineChars="0"/>
-        <w:jc w:val="both"/>
-        <w:rPr>
-          <w:rFonts w:hint="default" w:ascii="Kalinga" w:hAnsi="Kalinga"/>
-          <w:sz w:val="20"/>
-          <w:szCs w:val="20"/>
-        </w:rPr>
-      </w:pPr>
-      <w:r>
-        <w:rPr>
-          <w:rFonts w:hint="default" w:ascii="Kalinga" w:hAnsi="Kalinga"/>
-          <w:sz w:val="20"/>
-          <w:szCs w:val="20"/>
-        </w:rPr>
-        <w:t>Rekening Taplus Afiliasi atas nama Pemohon diblokir sebesar {{ blokir_angsuran_total | default('0', true) }} ({{ blokir_angsuran_total_terbilang | default('', true) }}) kali angsuran, {{ blokir_angsuran_pindah_gaji | default('0', true) }} ({{ blokir_angsuran_pindah_gaji_terbilang | default('', true) }}) kali untuk Perpindahan Gaji ke BNI (dapat dibuka setelah Gaji Pensiun tercermin di Rekening BNI), {{ blokir_angsuran_prapurna | default('0', true) }} ({{ blokir_angsuran_prapurna_terbilang | default('', true) }}) kali untuk Angsuran Masa Prapurna (dapat dibuka blokir setiap bulan untuk angsuran), {{ blokir_angsuran_lunas | default('0', true) }} ({{ blokir_angsuran_lunas_terbilang | default('', true) }}) kali Angsuran (pokok + bunga) ditambah saldo minimum Taplus dibuka saat kredit lunas. Dana ini dapat dipotong dari  Pencairan Kredit.</w:t>
-      </w:r>
-    </w:p>
-    <w:p>
-      <w:pPr>
-        <w:pStyle w:val="6"/>
-        <w:numPr>
-          <w:ilvl w:val="0"/>
-          <w:numId w:val="1"/>
-        </w:numPr>
-        <w:spacing w:line="240" w:lineRule="auto"/>
-        <w:ind w:left="360" w:leftChars="0" w:right="160" w:rightChars="0" w:hanging="280" w:firstLineChars="0"/>
-        <w:jc w:val="both"/>
-        <w:rPr>
-          <w:rFonts w:hint="default" w:ascii="Kalinga" w:hAnsi="Kalinga"/>
-          <w:sz w:val="20"/>
-          <w:szCs w:val="20"/>
-        </w:rPr>
-      </w:pPr>
-      <w:r>
-        <w:rPr>
-          <w:rFonts w:hint="default" w:ascii="Kalinga" w:hAnsi="Kalinga"/>
-          <w:sz w:val="20"/>
-          <w:szCs w:val="20"/>
-        </w:rPr>
-        <w:t>Apabila Dana Blokir tersebut dipotong dari pencairan kredit, pemohon wajib menyerahkan Surat Pernyataan yang isinya meminta kepada bank agar dana blokir rekening sebesar Angsuran perbulan dikali masa Pra Purna (masa sebelum Pensiun) dipotong dari dana pencairan Kredit.</w:t>
-      </w:r>
-    </w:p>
-    <w:p>
-      <w:pPr>
-        <w:pStyle w:val="6"/>
-        <w:numPr>
-          <w:ilvl w:val="0"/>
-          <w:numId w:val="1"/>
-        </w:numPr>
-        <w:spacing w:line="240" w:lineRule="auto"/>
-        <w:ind w:left="360" w:leftChars="0" w:right="160" w:rightChars="0" w:hanging="280" w:firstLineChars="0"/>
-        <w:jc w:val="both"/>
-        <w:rPr>
-          <w:rFonts w:hint="default" w:ascii="Kalinga" w:hAnsi="Kalinga"/>
-          <w:sz w:val="20"/>
-          <w:szCs w:val="20"/>
-        </w:rPr>
-      </w:pPr>
-      <w:r>
-        <w:rPr>
-          <w:rFonts w:hint="default" w:ascii="Kalinga" w:hAnsi="Kalinga"/>
-          <w:sz w:val="20"/>
-          <w:szCs w:val="20"/>
-        </w:rPr>
-        <w:t>Pembayaran kembali dilakukan dengan cara mendebet Rekening Afiliasi setiap bulan sebesar Angsuran Hutang Pokok ditambah Bunga.</w:t>
-      </w:r>
-    </w:p>
-    <w:p>
-      <w:pPr>
-        <w:pStyle w:val="6"/>
-        <w:numPr>
-          <w:ilvl w:val="0"/>
-          <w:numId w:val="1"/>
-        </w:numPr>
-        <w:spacing w:line="240" w:lineRule="auto"/>
-        <w:ind w:left="360" w:leftChars="0" w:right="160" w:rightChars="0" w:hanging="280" w:firstLineChars="0"/>
-        <w:jc w:val="both"/>
-        <w:rPr>
-          <w:rFonts w:hint="default" w:ascii="Kalinga" w:hAnsi="Kalinga"/>
-          <w:sz w:val="20"/>
-          <w:szCs w:val="20"/>
-        </w:rPr>
-      </w:pPr>
-      <w:r>
-        <w:rPr>
-          <w:rFonts w:hint="default" w:ascii="Kalinga" w:hAnsi="Kalinga"/>
-          <w:sz w:val="20"/>
-          <w:szCs w:val="20"/>
-        </w:rPr>
-        <w:t>Surat Kuasa Bermaterai Pengurusan Hak Pensiun Pemohon Kepada BNI</w:t>
-      </w:r>
-      <w:r>
-        <w:rPr>
-          <w:rFonts w:hint="default" w:ascii="Kalinga" w:hAnsi="Kalinga"/>
-          <w:sz w:val="20"/>
-          <w:szCs w:val="20"/>
-          <w:lang w:val="en-US"/>
-        </w:rPr>
-        <w:t>.</w:t>
-      </w:r>
-    </w:p>
-    <w:p>
-      <w:pPr>
-        <w:pStyle w:val="6"/>
-        <w:numPr>
-          <w:ilvl w:val="0"/>
-          <w:numId w:val="1"/>
-        </w:numPr>
-        <w:spacing w:line="240" w:lineRule="auto"/>
-        <w:ind w:left="360" w:leftChars="0" w:right="160" w:rightChars="0" w:hanging="280" w:firstLineChars="0"/>
-        <w:jc w:val="both"/>
-        <w:rPr>
-          <w:rFonts w:hint="default" w:ascii="Kalinga" w:hAnsi="Kalinga"/>
-          <w:sz w:val="20"/>
-          <w:szCs w:val="20"/>
-        </w:rPr>
-      </w:pPr>
-      <w:r>
-        <w:rPr>
-          <w:rFonts w:hint="default" w:ascii="Kalinga" w:hAnsi="Kalinga"/>
-          <w:sz w:val="20"/>
-          <w:szCs w:val="20"/>
-        </w:rPr>
-        <w:t xml:space="preserve">Surat Kuasa Bermaterai Dari Pemohon Kepada Biro Kepegawaian/ Tata Usaha / Seksi Personil/ Bagian Sumber Daya atau lainnya yang berwenang untuk menyerahkan Asli SK Pensiun kepada BNI </w:t>
-      </w:r>
-      <w:r>
-        <w:rPr>
-          <w:rFonts w:hint="default" w:ascii="Kalinga" w:hAnsi="Kalinga"/>
-          <w:sz w:val="20"/>
-          <w:szCs w:val="20"/>
-          <w:lang w:val="en-US"/>
-        </w:rPr>
-        <w:t>.</w:t>
-      </w:r>
-    </w:p>
-    <w:p>
-      <w:pPr>
-        <w:pStyle w:val="6"/>
-        <w:numPr>
-          <w:ilvl w:val="0"/>
-          <w:numId w:val="1"/>
-        </w:numPr>
-        <w:spacing w:line="240" w:lineRule="auto"/>
-        <w:ind w:left="360" w:leftChars="0" w:right="160" w:rightChars="0" w:hanging="280" w:firstLineChars="0"/>
-        <w:jc w:val="both"/>
-        <w:rPr>
-          <w:rFonts w:hint="default" w:ascii="Kalinga" w:hAnsi="Kalinga"/>
-          <w:sz w:val="20"/>
-          <w:szCs w:val="20"/>
-        </w:rPr>
-      </w:pPr>
-      <w:r>
-        <w:rPr>
-          <w:rFonts w:hint="default" w:ascii="Kalinga" w:hAnsi="Kalinga"/>
-          <w:sz w:val="20"/>
-          <w:szCs w:val="20"/>
-        </w:rPr>
-        <w:t>Surat Kuasa Bermaterai dari Pemohon Kepada BNI Untuk Mengurus Pengambilan Asli SK Pensiun di Biro Kepegawaian / Tata Usaha / Seksi Personil/ Bagian Sumber Daya atau lainnya yang berwenang.</w:t>
-      </w:r>
-    </w:p>
-    <w:p>
-      <w:pPr>
-        <w:pStyle w:val="6"/>
-        <w:numPr>
-          <w:ilvl w:val="0"/>
-          <w:numId w:val="1"/>
-        </w:numPr>
-        <w:spacing w:line="240" w:lineRule="auto"/>
-        <w:ind w:left="360" w:leftChars="0" w:right="160" w:rightChars="0" w:hanging="280" w:firstLineChars="0"/>
-        <w:jc w:val="both"/>
-        <w:rPr>
-          <w:rFonts w:hint="default" w:ascii="Kalinga" w:hAnsi="Kalinga"/>
-          <w:sz w:val="20"/>
-          <w:szCs w:val="20"/>
-        </w:rPr>
-      </w:pPr>
-      <w:r>
-        <w:rPr>
-          <w:rFonts w:hint="default" w:ascii="Kalinga" w:hAnsi="Kalinga"/>
-          <w:sz w:val="20"/>
-          <w:szCs w:val="20"/>
-        </w:rPr>
-        <w:t>Surat Pernyataan Bermaterai yang ditandatangani Pemohon yang menyatakan bahwa :</w:t>
-      </w:r>
-    </w:p>
-    <w:p>
-      <w:pPr>
-        <w:pStyle w:val="6"/>
-        <w:numPr>
-          <w:ilvl w:val="0"/>
-          <w:numId w:val="1"/>
-        </w:numPr>
-        <w:spacing w:line="240" w:lineRule="auto"/>
-        <w:ind w:left="660" w:leftChars="0" w:right="160" w:rightChars="0" w:hanging="280" w:firstLineChars="0"/>
-        <w:jc w:val="both"/>
-        <w:rPr>
-          <w:rFonts w:hint="default" w:ascii="Kalinga" w:hAnsi="Kalinga"/>
-          <w:b w:val="0"/>
-          <w:bCs w:val="0"/>
-          <w:sz w:val="20"/>
-          <w:szCs w:val="20"/>
-        </w:rPr>
-      </w:pPr>
-      <w:r>
-        <w:rPr>
-          <w:rFonts w:hint="default" w:ascii="Kalinga" w:hAnsi="Kalinga"/>
-          <w:b w:val="0"/>
-          <w:bCs w:val="0"/>
-          <w:sz w:val="20"/>
-          <w:szCs w:val="20"/>
-        </w:rPr>
-        <w:t>Pemohon memiliki Kondite yang baik ( tidak melanggar hukum/ Kode etik kerja )</w:t>
-      </w:r>
-      <w:r>
-        <w:rPr>
-          <w:rFonts w:hint="default" w:ascii="Kalinga" w:hAnsi="Kalinga"/>
-          <w:b w:val="0"/>
-          <w:bCs w:val="0"/>
-          <w:sz w:val="20"/>
-          <w:szCs w:val="20"/>
-          <w:lang w:val="en-US"/>
-        </w:rPr>
-        <w:t>.</w:t>
-      </w:r>
-    </w:p>
-    <w:p>
-      <w:pPr>
-        <w:pStyle w:val="6"/>
-        <w:numPr>
-          <w:ilvl w:val="0"/>
-          <w:numId w:val="1"/>
-        </w:numPr>
-        <w:spacing w:line="240" w:lineRule="auto"/>
-        <w:ind w:left="660" w:leftChars="0" w:right="160" w:rightChars="0" w:hanging="280" w:firstLineChars="0"/>
-        <w:jc w:val="both"/>
-        <w:rPr>
-          <w:rFonts w:hint="default" w:ascii="Kalinga" w:hAnsi="Kalinga"/>
-          <w:b w:val="0"/>
-          <w:bCs w:val="0"/>
-          <w:sz w:val="20"/>
-          <w:szCs w:val="20"/>
-        </w:rPr>
-      </w:pPr>
-      <w:r>
-        <w:rPr>
-          <w:rFonts w:hint="default" w:ascii="Kalinga" w:hAnsi="Kalinga"/>
-          <w:b w:val="0"/>
-          <w:bCs w:val="0"/>
-          <w:sz w:val="20"/>
-          <w:szCs w:val="20"/>
-        </w:rPr>
-        <w:t>Pemohon akan menyalurkan manfaat pensiunnya ke rekening taplus (rekening Afiliasi)</w:t>
-      </w:r>
-      <w:r>
-        <w:rPr>
-          <w:rFonts w:hint="default" w:ascii="Kalinga" w:hAnsi="Kalinga"/>
-          <w:b w:val="0"/>
-          <w:bCs w:val="0"/>
-          <w:sz w:val="20"/>
-          <w:szCs w:val="20"/>
-          <w:lang w:val="en-US"/>
-        </w:rPr>
-        <w:t>.</w:t>
-      </w:r>
-    </w:p>
-    <w:p>
-      <w:pPr>
-        <w:pStyle w:val="6"/>
-        <w:numPr>
-          <w:ilvl w:val="0"/>
-          <w:numId w:val="1"/>
-        </w:numPr>
-        <w:spacing w:line="240" w:lineRule="auto"/>
-        <w:ind w:left="660" w:leftChars="0" w:right="160" w:rightChars="0" w:hanging="280" w:firstLineChars="0"/>
-        <w:jc w:val="both"/>
-        <w:rPr>
-          <w:rFonts w:hint="default" w:ascii="Kalinga" w:hAnsi="Kalinga"/>
-          <w:b w:val="0"/>
-          <w:bCs w:val="0"/>
-          <w:sz w:val="20"/>
-          <w:szCs w:val="20"/>
-        </w:rPr>
-      </w:pPr>
-      <w:r>
-        <w:rPr>
-          <w:rFonts w:hint="default" w:ascii="Kalinga" w:hAnsi="Kalinga"/>
-          <w:b w:val="0"/>
-          <w:bCs w:val="0"/>
-          <w:sz w:val="20"/>
-          <w:szCs w:val="20"/>
-        </w:rPr>
-        <w:t>Pemohon tidak akan memindahkan Payroll Ke bank Lain sampai dengan kredit lunas</w:t>
-      </w:r>
-      <w:r>
-        <w:rPr>
-          <w:rFonts w:hint="default" w:ascii="Kalinga" w:hAnsi="Kalinga"/>
-          <w:b w:val="0"/>
-          <w:bCs w:val="0"/>
-          <w:sz w:val="20"/>
-          <w:szCs w:val="20"/>
-          <w:lang w:val="en-US"/>
-        </w:rPr>
-        <w:t>.</w:t>
-      </w:r>
-    </w:p>
-    <w:p>
-      <w:pPr>
-        <w:pStyle w:val="6"/>
-        <w:numPr>
-          <w:ilvl w:val="0"/>
-          <w:numId w:val="1"/>
-        </w:numPr>
-        <w:spacing w:line="240" w:lineRule="auto"/>
-        <w:ind w:left="660" w:leftChars="0" w:right="160" w:rightChars="0" w:hanging="280" w:firstLineChars="0"/>
-        <w:jc w:val="both"/>
-        <w:rPr>
-          <w:rFonts w:hint="default" w:ascii="Kalinga" w:hAnsi="Kalinga"/>
-          <w:sz w:val="20"/>
-          <w:szCs w:val="20"/>
-        </w:rPr>
-      </w:pPr>
-      <w:r>
-        <w:rPr>
-          <w:rFonts w:hint="default" w:ascii="Kalinga" w:hAnsi="Kalinga"/>
-          <w:b w:val="0"/>
-          <w:bCs w:val="0"/>
-          <w:sz w:val="20"/>
-          <w:szCs w:val="20"/>
-        </w:rPr>
-        <w:t>P</w:t>
-      </w:r>
-      <w:r>
-        <w:rPr>
-          <w:rFonts w:hint="default" w:ascii="Kalinga" w:hAnsi="Kalinga"/>
-          <w:sz w:val="20"/>
-          <w:szCs w:val="20"/>
-        </w:rPr>
-        <w:t>emohon bersedia melakukan Pengurusan Penerbitan Asli Surat Keputusan (SK) Pensiun Pemohon bersama dengan Pegawai BNI ke Biro Kepegawaian / Tata Usaha / Seksi Personil/ Bagian Sumber Daya atau lainnya yang berwenang di Instansi Tempat Pemohon Bekerja</w:t>
-      </w:r>
-      <w:r>
-        <w:rPr>
-          <w:rFonts w:hint="default" w:ascii="Kalinga" w:hAnsi="Kalinga"/>
-          <w:sz w:val="20"/>
-          <w:szCs w:val="20"/>
-          <w:lang w:val="en-US"/>
-        </w:rPr>
-        <w:t>.</w:t>
-      </w:r>
-    </w:p>
-    <w:p>
-      <w:pPr>
-        <w:pStyle w:val="6"/>
-        <w:numPr>
-          <w:ilvl w:val="0"/>
-          <w:numId w:val="1"/>
-        </w:numPr>
-        <w:spacing w:line="240" w:lineRule="auto"/>
-        <w:ind w:left="360" w:leftChars="0" w:right="160" w:rightChars="0" w:hanging="280" w:firstLineChars="0"/>
-        <w:jc w:val="both"/>
-        <w:rPr>
-          <w:rFonts w:hint="default" w:ascii="Kalinga" w:hAnsi="Kalinga"/>
-          <w:sz w:val="20"/>
-          <w:szCs w:val="20"/>
-        </w:rPr>
-      </w:pPr>
-      <w:r>
-        <w:rPr>
-          <w:rFonts w:hint="default" w:ascii="Kalinga" w:hAnsi="Kalinga"/>
-          <w:sz w:val="20"/>
-          <w:szCs w:val="20"/>
-        </w:rPr>
-        <w:t>Pada saat Status Kepegawaian Pemohon sudah menjadi Pensiun adalah sbb :</w:t>
-      </w:r>
-    </w:p>
-    <w:p>
-      <w:pPr>
-        <w:pStyle w:val="6"/>
-        <w:numPr>
-          <w:ilvl w:val="0"/>
-          <w:numId w:val="1"/>
-        </w:numPr>
-        <w:spacing w:line="240" w:lineRule="auto"/>
-        <w:ind w:left="660" w:leftChars="0" w:right="160" w:rightChars="0" w:hanging="280" w:firstLineChars="0"/>
-        <w:jc w:val="both"/>
-        <w:rPr>
-          <w:rFonts w:hint="default" w:ascii="Kalinga" w:hAnsi="Kalinga"/>
-          <w:b w:val="0"/>
-          <w:bCs w:val="0"/>
-          <w:sz w:val="20"/>
-          <w:szCs w:val="20"/>
-        </w:rPr>
-      </w:pPr>
-      <w:r>
-        <w:rPr>
-          <w:rFonts w:hint="default" w:ascii="Kalinga" w:hAnsi="Kalinga"/>
-          <w:b w:val="0"/>
-          <w:bCs w:val="0"/>
-          <w:sz w:val="20"/>
-          <w:szCs w:val="20"/>
-        </w:rPr>
-        <w:t>Menyerahkan Asli Surat keputusan (SK) Pensiun atas nama Pemohon</w:t>
-      </w:r>
-      <w:r>
-        <w:rPr>
-          <w:rFonts w:hint="default" w:ascii="Kalinga" w:hAnsi="Kalinga"/>
-          <w:b w:val="0"/>
-          <w:bCs w:val="0"/>
-          <w:sz w:val="20"/>
-          <w:szCs w:val="20"/>
-          <w:lang w:val="en-US"/>
-        </w:rPr>
-        <w:t>.</w:t>
-      </w:r>
-    </w:p>
-    <w:p>
-      <w:pPr>
-        <w:pStyle w:val="6"/>
-        <w:numPr>
-          <w:ilvl w:val="0"/>
-          <w:numId w:val="1"/>
-        </w:numPr>
-        <w:spacing w:line="240" w:lineRule="auto"/>
-        <w:ind w:left="660" w:leftChars="0" w:right="160" w:rightChars="0" w:hanging="280" w:firstLineChars="0"/>
-        <w:jc w:val="both"/>
-        <w:rPr>
-          <w:rFonts w:hint="default" w:ascii="Kalinga" w:hAnsi="Kalinga"/>
-          <w:sz w:val="20"/>
-          <w:szCs w:val="20"/>
-        </w:rPr>
-      </w:pPr>
-      <w:r>
-        <w:rPr>
-          <w:rFonts w:hint="default" w:ascii="Kalinga" w:hAnsi="Kalinga"/>
-          <w:b w:val="0"/>
-          <w:bCs w:val="0"/>
-          <w:sz w:val="20"/>
-          <w:szCs w:val="20"/>
-        </w:rPr>
-        <w:t>M</w:t>
-      </w:r>
-      <w:r>
-        <w:rPr>
-          <w:rFonts w:hint="default" w:ascii="Kalinga" w:hAnsi="Kalinga"/>
-          <w:sz w:val="20"/>
-          <w:szCs w:val="20"/>
-        </w:rPr>
-        <w:t>anfaat Pensiun Pemohon Disalurkan ke Rekening TAPLUS Afiliasi Pinjaman (tetap diblokir minimal sebesar 2 kali angsuran)</w:t>
-      </w:r>
-      <w:r>
-        <w:rPr>
-          <w:rFonts w:hint="default" w:ascii="Kalinga" w:hAnsi="Kalinga"/>
-          <w:sz w:val="20"/>
-          <w:szCs w:val="20"/>
-          <w:lang w:val="en-US"/>
-        </w:rPr>
-        <w:t>.</w:t>
-      </w:r>
-    </w:p>
-    <w:p>
-      <w:pPr>
-        <w:pStyle w:val="6"/>
-        <w:numPr>
-          <w:ilvl w:val="0"/>
-          <w:numId w:val="1"/>
-        </w:numPr>
-        <w:spacing w:line="240" w:lineRule="auto"/>
-        <w:ind w:left="360" w:leftChars="0" w:right="160" w:rightChars="0" w:hanging="280" w:firstLineChars="0"/>
-        <w:jc w:val="both"/>
-        <w:rPr>
-          <w:rFonts w:hint="default" w:ascii="Kalinga" w:hAnsi="Kalinga"/>
-          <w:sz w:val="20"/>
-          <w:szCs w:val="20"/>
-        </w:rPr>
-      </w:pPr>
-      <w:r>
-        <w:rPr>
-          <w:rFonts w:hint="default" w:ascii="Kalinga" w:hAnsi="Kalinga"/>
-          <w:sz w:val="20"/>
-          <w:szCs w:val="20"/>
-        </w:rPr>
-        <w:t>Biaya Propisi {{ biaya_provisi_persen | default('0', true) }}% dari Maksimum Kredit atau sebesar Rp. {{ biaya_provisi_nominal | default('0', true) }},- dan {% if bebas_biaya_administrasi == 'ya' %}Bebas Biaya Administrasi{% else %}biaya Administrasi sebesar Rp. {{ biaya_administrasi | default('0', true) }},-{% endif %}</w:t>
-      </w:r>
-      <w:r>
-        <w:rPr>
-          <w:rFonts w:hint="default" w:ascii="Kalinga" w:hAnsi="Kalinga"/>
-          <w:sz w:val="20"/>
-          <w:szCs w:val="20"/>
-          <w:lang w:val="en-US"/>
-        </w:rPr>
-        <w:t xml:space="preserve">. </w:t>
-      </w:r>
-      <w:r>
+    <w:bookmarkEnd w:id="41"/>
+    <w:p>
+      <w:pPr>
+        <w:pStyle w:val="6"/>
+        <w:numPr>
+          <w:ilvl w:val="0"/>
+          <w:numId w:val="1"/>
+        </w:numPr>
+        <w:spacing w:line="240" w:lineRule="auto"/>
+        <w:ind w:left="360" w:leftChars="0" w:right="160" w:rightChars="0" w:hanging="280" w:firstLineChars="0"/>
+        <w:jc w:val="both"/>
         <w:rPr>
           <w:rFonts w:hint="default" w:ascii="Kalinga" w:hAnsi="Kalinga" w:cs="Kalinga"/>
           <w:color w:val="auto"/>
@@ -5743,91 +5208,248 @@
           <w:szCs w:val="20"/>
           <w:lang w:val="en-US"/>
         </w:rPr>
-        <w:t>(Cfm Surat No. DNS/5.4/8023 Perihal Program Pricing BNI Fleksi (Aktif &amp; Pensiun) Semester II 2025 Tanggal 01-09-2025).</w:t>
-      </w:r>
-    </w:p>
-    <w:p>
-      <w:pPr>
-        <w:pStyle w:val="6"/>
-        <w:numPr>
-          <w:ilvl w:val="0"/>
-          <w:numId w:val="1"/>
-        </w:numPr>
-        <w:spacing w:line="240" w:lineRule="auto"/>
-        <w:ind w:left="360" w:leftChars="0" w:right="160" w:rightChars="0" w:hanging="280" w:firstLineChars="0"/>
-        <w:jc w:val="both"/>
-        <w:rPr>
-          <w:rFonts w:hint="default" w:ascii="Kalinga" w:hAnsi="Kalinga"/>
-          <w:sz w:val="20"/>
-          <w:szCs w:val="20"/>
-        </w:rPr>
-      </w:pPr>
-      <w:r>
-        <w:rPr>
-          <w:rFonts w:hint="default" w:ascii="Kalinga" w:hAnsi="Kalinga"/>
-          <w:sz w:val="20"/>
-          <w:szCs w:val="20"/>
-        </w:rPr>
-        <w:t>Pemohon wajib ditutup Asuransi Jiwa selama Jangka Waktu Kredit.</w:t>
-      </w:r>
-    </w:p>
-    <w:p>
-      <w:pPr>
-        <w:pStyle w:val="6"/>
-        <w:numPr>
-          <w:ilvl w:val="0"/>
-          <w:numId w:val="1"/>
-        </w:numPr>
-        <w:spacing w:line="240" w:lineRule="auto"/>
-        <w:ind w:left="360" w:leftChars="0" w:right="160" w:rightChars="0" w:hanging="280" w:firstLineChars="0"/>
-        <w:jc w:val="both"/>
-        <w:rPr>
-          <w:rFonts w:hint="default" w:ascii="Kalinga" w:hAnsi="Kalinga"/>
-          <w:sz w:val="20"/>
-          <w:szCs w:val="20"/>
-        </w:rPr>
-      </w:pPr>
-      <w:r>
-        <w:rPr>
-          <w:rFonts w:hint="default" w:ascii="Kalinga" w:hAnsi="Kalinga"/>
-          <w:sz w:val="20"/>
-          <w:szCs w:val="20"/>
-        </w:rPr>
-        <w:t>Menyerahkan Surat Pernyataan Kemampuan membayar apabila Tunjangan dihilangkan.</w:t>
-      </w:r>
-    </w:p>
-    <w:p>
-      <w:pPr>
-        <w:pStyle w:val="6"/>
-        <w:numPr>
-          <w:ilvl w:val="0"/>
-          <w:numId w:val="1"/>
-        </w:numPr>
-        <w:spacing w:line="240" w:lineRule="auto"/>
-        <w:ind w:left="360" w:leftChars="0" w:right="160" w:rightChars="0" w:hanging="280" w:firstLineChars="0"/>
-        <w:jc w:val="both"/>
-        <w:rPr>
-          <w:rFonts w:hint="default" w:ascii="Kalinga" w:hAnsi="Kalinga"/>
-          <w:sz w:val="20"/>
-          <w:szCs w:val="20"/>
-        </w:rPr>
-      </w:pPr>
-      <w:r>
-        <w:rPr>
-          <w:rFonts w:hint="default" w:ascii="Kalinga" w:hAnsi="Kalinga"/>
-          <w:sz w:val="20"/>
-          <w:szCs w:val="20"/>
-        </w:rPr>
-        <w:t>Menyerahkan Surat Kesanggupan Pembayaran Angsuran Kredit Perbulan Diatas 70% dari Uang Pensiun atau Manfaat Pensiun Bulanan Yang Diterima</w:t>
-      </w:r>
-      <w:r>
-        <w:rPr>
-          <w:rFonts w:hint="default" w:ascii="Kalinga" w:hAnsi="Kalinga"/>
-          <w:sz w:val="20"/>
-          <w:szCs w:val="20"/>
-          <w:lang w:val="en-US"/>
-        </w:rPr>
-        <w:t>.</w:t>
+      </w:pPr>
+      <w:r>
+        <w:rPr>
+          <w:rFonts w:hint="default" w:ascii="Kalinga" w:hAnsi="Kalinga" w:cs="Kalinga"/>
+          <w:color w:val="auto"/>
+          <w:sz w:val="20"/>
+          <w:szCs w:val="20"/>
+          <w:lang w:val="en-US"/>
+        </w:rPr>
+        <w:t>Aplikasi Permohon Kredit telah ditandatangani oleh Pemohon.</w:t>
+      </w:r>
+    </w:p>
+    <w:p>
+      <w:pPr>
+        <w:pStyle w:val="6"/>
+        <w:numPr>
+          <w:ilvl w:val="0"/>
+          <w:numId w:val="1"/>
+        </w:numPr>
+        <w:spacing w:line="240" w:lineRule="auto"/>
+        <w:ind w:left="360" w:leftChars="0" w:right="160" w:rightChars="0" w:hanging="280" w:firstLineChars="0"/>
+        <w:jc w:val="both"/>
+        <w:rPr>
+          <w:rFonts w:hint="default" w:ascii="Kalinga" w:hAnsi="Kalinga" w:cs="Kalinga"/>
+          <w:color w:val="auto"/>
+          <w:sz w:val="20"/>
+          <w:szCs w:val="20"/>
+          <w:lang w:val="en-US"/>
+        </w:rPr>
+      </w:pPr>
+      <w:r>
+        <w:rPr>
+          <w:rFonts w:hint="default" w:ascii="Kalinga" w:hAnsi="Kalinga" w:cs="Kalinga"/>
+          <w:color w:val="auto"/>
+          <w:sz w:val="20"/>
+          <w:szCs w:val="20"/>
+          <w:lang w:val="en-US"/>
+        </w:rPr>
+        <w:t>Membuka Rekening BNI Taplus atas nama Pemohon yang akan dijadikan sebagai Rekening Afiliasi Kredit.</w:t>
+      </w:r>
+    </w:p>
+    <w:p>
+      <w:pPr>
+        <w:pStyle w:val="6"/>
+        <w:numPr>
+          <w:ilvl w:val="0"/>
+          <w:numId w:val="1"/>
+        </w:numPr>
+        <w:spacing w:line="240" w:lineRule="auto"/>
+        <w:ind w:left="360" w:leftChars="0" w:right="160" w:rightChars="0" w:hanging="280" w:firstLineChars="0"/>
+        <w:jc w:val="both"/>
+        <w:rPr>
+          <w:rFonts w:hint="default" w:ascii="Kalinga" w:hAnsi="Kalinga" w:cs="Kalinga"/>
+          <w:color w:val="auto"/>
+          <w:sz w:val="20"/>
+          <w:szCs w:val="20"/>
+          <w:lang w:val="en-US"/>
+        </w:rPr>
+      </w:pPr>
+      <w:r>
+        <w:rPr>
+          <w:rFonts w:hint="default" w:ascii="Kalinga" w:hAnsi="Kalinga" w:cs="Kalinga"/>
+          <w:color w:val="auto"/>
+          <w:sz w:val="20"/>
+          <w:szCs w:val="20"/>
+          <w:lang w:val="en-US"/>
+        </w:rPr>
+        <w:t>Apabila Dana Blokir tersebut dipotong dari pencairan kredit, pemohon wajib meyerahkan Surat Pernyataan yang isinya meminta kepada bank agar dana blokir rekening sebesar Angsuran perbulan dikali masa Pra Purna (masa sebelum Pensiun) dipotong dari dana pencairan Kredit.</w:t>
+      </w:r>
+    </w:p>
+    <w:p>
+      <w:pPr>
+        <w:pStyle w:val="6"/>
+        <w:numPr>
+          <w:ilvl w:val="0"/>
+          <w:numId w:val="1"/>
+        </w:numPr>
+        <w:spacing w:line="240" w:lineRule="auto"/>
+        <w:ind w:left="360" w:leftChars="0" w:right="160" w:rightChars="0" w:hanging="280" w:firstLineChars="0"/>
+        <w:jc w:val="both"/>
+        <w:rPr>
+          <w:rFonts w:hint="default" w:ascii="Kalinga" w:hAnsi="Kalinga" w:cs="Kalinga"/>
+          <w:color w:val="auto"/>
+          <w:sz w:val="20"/>
+          <w:szCs w:val="20"/>
+          <w:lang w:val="en-US"/>
+        </w:rPr>
+      </w:pPr>
+      <w:r>
+        <w:rPr>
+          <w:rFonts w:hint="default" w:ascii="Kalinga" w:hAnsi="Kalinga" w:cs="Kalinga"/>
+          <w:color w:val="auto"/>
+          <w:sz w:val="20"/>
+          <w:szCs w:val="20"/>
+          <w:lang w:val="en-US"/>
+        </w:rPr>
+        <w:t>Pembayaran kembali dilakukan dengan cara mendebet Rekening Afiliasi setiap bulan sebesar Angsuran Hutang Pokok dan Bunga..</w:t>
+      </w:r>
+    </w:p>
+    <w:p>
+      <w:pPr>
+        <w:pStyle w:val="6"/>
+        <w:numPr>
+          <w:ilvl w:val="0"/>
+          <w:numId w:val="1"/>
+        </w:numPr>
+        <w:spacing w:line="240" w:lineRule="auto"/>
+        <w:ind w:left="360" w:leftChars="0" w:right="160" w:rightChars="0" w:hanging="280" w:firstLineChars="0"/>
+        <w:jc w:val="both"/>
+        <w:rPr>
+          <w:rFonts w:hint="default" w:ascii="Kalinga" w:hAnsi="Kalinga" w:cs="Kalinga"/>
+          <w:color w:val="auto"/>
+          <w:sz w:val="20"/>
+          <w:szCs w:val="20"/>
+          <w:lang w:val="en-US"/>
+        </w:rPr>
+      </w:pPr>
+      <w:r>
+        <w:rPr>
+          <w:rFonts w:hint="default" w:ascii="Kalinga" w:hAnsi="Kalinga" w:cs="Kalinga"/>
+          <w:color w:val="auto"/>
+          <w:sz w:val="20"/>
+          <w:szCs w:val="20"/>
+          <w:lang w:val="en-US"/>
+        </w:rPr>
+        <w:t>Pada saat Pensiun Pemohon Wajib Menyerahkan Asli SK Pensiun atas nama Pemohon.</w:t>
+      </w:r>
+    </w:p>
+    <w:p>
+      <w:pPr>
+        <w:pStyle w:val="6"/>
+        <w:numPr>
+          <w:ilvl w:val="0"/>
+          <w:numId w:val="1"/>
+        </w:numPr>
+        <w:spacing w:line="240" w:lineRule="auto"/>
+        <w:ind w:left="360" w:leftChars="0" w:right="160" w:rightChars="0" w:hanging="280" w:firstLineChars="0"/>
+        <w:jc w:val="both"/>
+        <w:rPr>
+          <w:rFonts w:hint="default" w:ascii="Kalinga" w:hAnsi="Kalinga" w:cs="Kalinga"/>
+          <w:color w:val="auto"/>
+          <w:sz w:val="20"/>
+          <w:szCs w:val="20"/>
+          <w:lang w:val="en-US"/>
+        </w:rPr>
+      </w:pPr>
+      <w:r>
+        <w:rPr>
+          <w:rFonts w:hint="default" w:ascii="Kalinga" w:hAnsi="Kalinga" w:cs="Kalinga"/>
+          <w:color w:val="auto"/>
+          <w:sz w:val="20"/>
+          <w:szCs w:val="20"/>
+          <w:lang w:val="en-US"/>
+        </w:rPr>
+        <w:t>Surat Kuasa Bermaterai Pengurusan Hak Pensiun Pemohon Kepada BNI.</w:t>
+      </w:r>
+    </w:p>
+    <w:p>
+      <w:pPr>
+        <w:pStyle w:val="6"/>
+        <w:numPr>
+          <w:ilvl w:val="0"/>
+          <w:numId w:val="1"/>
+        </w:numPr>
+        <w:spacing w:line="240" w:lineRule="auto"/>
+        <w:ind w:left="360" w:leftChars="0" w:right="160" w:rightChars="0" w:hanging="280" w:firstLineChars="0"/>
+        <w:jc w:val="both"/>
+        <w:rPr>
+          <w:rFonts w:hint="default" w:ascii="Kalinga" w:hAnsi="Kalinga" w:cs="Kalinga"/>
+          <w:color w:val="auto"/>
+          <w:sz w:val="20"/>
+          <w:szCs w:val="20"/>
+          <w:lang w:val="en-US"/>
+        </w:rPr>
+      </w:pPr>
+      <w:r>
+        <w:rPr>
+          <w:rFonts w:hint="default" w:ascii="Kalinga" w:hAnsi="Kalinga" w:cs="Kalinga"/>
+          <w:color w:val="auto"/>
+          <w:sz w:val="20"/>
+          <w:szCs w:val="20"/>
+          <w:lang w:val="en-US"/>
+        </w:rPr>
+        <w:t>Surat Kuasa Bermaterai Dari Pemohon Kepada Biro Kepegawaian/Tata Usaha / Seksi Personil/Bagian Sumber Daya atau lainnya yang berwenang untuk menyerahkan Asli SK Pensiun kepada BNI.</w:t>
+      </w:r>
+    </w:p>
+    <w:p>
+      <w:pPr>
+        <w:pStyle w:val="6"/>
+        <w:numPr>
+          <w:ilvl w:val="0"/>
+          <w:numId w:val="1"/>
+        </w:numPr>
+        <w:spacing w:line="240" w:lineRule="auto"/>
+        <w:ind w:left="360" w:leftChars="0" w:right="160" w:rightChars="0" w:hanging="280" w:firstLineChars="0"/>
+        <w:jc w:val="both"/>
+        <w:rPr>
+          <w:rFonts w:hint="default" w:ascii="Kalinga" w:hAnsi="Kalinga" w:cs="Kalinga"/>
+          <w:color w:val="auto"/>
+          <w:sz w:val="20"/>
+          <w:szCs w:val="20"/>
+          <w:lang w:val="en-US"/>
+        </w:rPr>
+      </w:pPr>
+      <w:r>
+        <w:rPr>
+          <w:rFonts w:hint="default" w:ascii="Kalinga" w:hAnsi="Kalinga" w:cs="Kalinga"/>
+          <w:color w:val="auto"/>
+          <w:sz w:val="20"/>
+          <w:szCs w:val="20"/>
+          <w:lang w:val="en-US"/>
+        </w:rPr>
+        <w:t>Surat Kuasa Bermaterai dari Pemohon Kepada BNI Untuk Mengurus Pengambilan Asli SK Pensiun di Biro Kepegawaian /Tata Usaha / Seksi Personil/Bagian Sumber Daya atau lainnya yang berwenang.</w:t>
+      </w:r>
+    </w:p>
+    <w:p>
+      <w:pPr>
+        <w:pStyle w:val="6"/>
+        <w:numPr>
+          <w:ilvl w:val="0"/>
+          <w:numId w:val="1"/>
+        </w:numPr>
+        <w:spacing w:line="240" w:lineRule="auto"/>
+        <w:ind w:left="360" w:leftChars="0" w:right="160" w:rightChars="0" w:hanging="280" w:firstLineChars="0"/>
+        <w:jc w:val="both"/>
+        <w:rPr>
+          <w:rFonts w:hint="default" w:ascii="Kalinga" w:hAnsi="Kalinga" w:cs="Kalinga"/>
+          <w:color w:val="auto"/>
+          <w:sz w:val="20"/>
+          <w:szCs w:val="20"/>
+          <w:lang w:val="en-US"/>
+        </w:rPr>
+      </w:pPr>
+      <w:r>
+        <w:rPr>
+          <w:rFonts w:hint="default" w:ascii="Kalinga" w:hAnsi="Kalinga" w:cs="Kalinga"/>
+          <w:color w:val="auto"/>
+          <w:sz w:val="20"/>
+          <w:szCs w:val="20"/>
+          <w:lang w:val="en-US"/>
+        </w:rPr>
+        <w:t>Menyerahkan Surat Pernyataan Kemampuan Membayar apabila Tunjangan Dihilangkan.</w:t>
       </w:r>
     </w:p>
     <w:p>
@@ -6065,13 +5687,13 @@
           <w:szCs w:val="20"/>
         </w:rPr>
       </w:pPr>
-      <w:bookmarkStart w:id="47" w:name="OLE_LINK64"/>
-      <w:bookmarkStart w:id="48" w:name="OLE_LINK13"/>
-      <w:bookmarkStart w:id="49" w:name="OLE_LINK70"/>
-      <w:bookmarkStart w:id="50" w:name="OLE_LINK23"/>
+      <w:bookmarkStart w:id="46" w:name="OLE_LINK64"/>
+      <w:bookmarkStart w:id="47" w:name="OLE_LINK40"/>
+      <w:bookmarkStart w:id="48" w:name="OLE_LINK23"/>
+      <w:bookmarkStart w:id="49" w:name="OLE_LINK24"/>
+      <w:bookmarkStart w:id="50" w:name="OLE_LINK13"/>
       <w:bookmarkStart w:id="51" w:name="OLE_LINK58"/>
-      <w:bookmarkStart w:id="52" w:name="OLE_LINK24"/>
-      <w:bookmarkStart w:id="53" w:name="OLE_LINK40"/>
+      <w:bookmarkStart w:id="52" w:name="OLE_LINK70"/>
       <w:r>
         <w:rPr>
           <w:rFonts w:ascii="Kalinga" w:hAnsi="Kalinga" w:cs="Kalinga"/>
@@ -6113,12 +5735,79 @@
         <w:ind w:left="360" w:leftChars="0" w:right="160" w:rightChars="0" w:hanging="280" w:firstLineChars="0"/>
         <w:jc w:val="both"/>
         <w:rPr>
-          <w:rFonts w:hint="default" w:ascii="Kalinga" w:hAnsi="Kalinga"/>
-          <w:sz w:val="20"/>
-          <w:szCs w:val="20"/>
-        </w:rPr>
-      </w:pPr>
-      <w:bookmarkStart w:id="54" w:name="OLE_LINK4"/>
+          <w:rFonts w:hint="default" w:ascii="Kalinga" w:hAnsi="Kalinga" w:cs="Kalinga"/>
+          <w:color w:val="auto"/>
+          <w:sz w:val="20"/>
+          <w:szCs w:val="20"/>
+          <w:lang w:val="en-US"/>
+        </w:rPr>
+      </w:pPr>
+      <w:bookmarkStart w:id="53" w:name="OLE_LINK4"/>
+      <w:r>
+        <w:rPr>
+          <w:rFonts w:hint="default" w:ascii="Kalinga" w:hAnsi="Kalinga"/>
+          <w:color w:val="auto"/>
+          <w:sz w:val="20"/>
+          <w:szCs w:val="20"/>
+        </w:rPr>
+        <w:t>P</w:t>
+      </w:r>
+      <w:r>
+        <w:rPr>
+          <w:rFonts w:hint="default" w:ascii="Kalinga" w:hAnsi="Kalinga" w:cs="Kalinga"/>
+          <w:color w:val="auto"/>
+          <w:sz w:val="20"/>
+          <w:szCs w:val="20"/>
+          <w:lang w:val="en-US"/>
+        </w:rPr>
+        <w:t>erjanjian Kredit telah ditandatangani oleh Pemohon.</w:t>
+      </w:r>
+    </w:p>
+    <w:p>
+      <w:pPr>
+        <w:pStyle w:val="6"/>
+        <w:numPr>
+          <w:ilvl w:val="0"/>
+          <w:numId w:val="1"/>
+        </w:numPr>
+        <w:spacing w:line="240" w:lineRule="auto"/>
+        <w:ind w:left="360" w:leftChars="0" w:right="160" w:rightChars="0" w:hanging="280" w:firstLineChars="0"/>
+        <w:jc w:val="both"/>
+        <w:rPr>
+          <w:rFonts w:hint="default" w:ascii="Kalinga" w:hAnsi="Kalinga" w:cs="Kalinga"/>
+          <w:color w:val="auto"/>
+          <w:sz w:val="20"/>
+          <w:szCs w:val="20"/>
+          <w:lang w:val="en-US"/>
+        </w:rPr>
+      </w:pPr>
+      <w:r>
+        <w:rPr>
+          <w:rFonts w:hint="default" w:ascii="Kalinga" w:hAnsi="Kalinga" w:cs="Kalinga"/>
+          <w:color w:val="auto"/>
+          <w:sz w:val="20"/>
+          <w:szCs w:val="20"/>
+          <w:lang w:val="en-US"/>
+        </w:rPr>
+        <w:t>Telah dilakukan Penutupan Asuransi Jiwa Kredit atas nama Pemohon dibuktikan dengan Covernote dari Asuransi Rekanan BNI.</w:t>
+      </w:r>
+    </w:p>
+    <w:p>
+      <w:pPr>
+        <w:pStyle w:val="6"/>
+        <w:numPr>
+          <w:ilvl w:val="0"/>
+          <w:numId w:val="1"/>
+        </w:numPr>
+        <w:spacing w:line="240" w:lineRule="auto"/>
+        <w:ind w:left="360" w:leftChars="0" w:right="160" w:rightChars="0" w:hanging="280" w:firstLineChars="0"/>
+        <w:jc w:val="both"/>
+        <w:rPr>
+          <w:rFonts w:hint="default" w:ascii="Kalinga" w:hAnsi="Kalinga"/>
+          <w:sz w:val="20"/>
+          <w:szCs w:val="20"/>
+        </w:rPr>
+      </w:pPr>
       <w:r>
         <w:rPr>
           <w:rFonts w:ascii="Kalinga" w:hAnsi="Kalinga" w:cs="Kalinga"/>
@@ -6127,507 +5816,610 @@
         </w:rPr>
         <w:t>P</w:t>
       </w:r>
+      <w:bookmarkEnd w:id="46"/>
+      <w:bookmarkEnd w:id="53"/>
+      <w:r>
+        <w:rPr>
+          <w:rFonts w:hint="default" w:ascii="Kalinga" w:hAnsi="Kalinga"/>
+          <w:sz w:val="20"/>
+          <w:szCs w:val="20"/>
+        </w:rPr>
+        <w:t>encairan Kredit dengan Maksimum Kredit sebesar Rp. {{ usulan_plafon_kredit | default('0', true) }},- dilakukan secara sekaligus ke Rekening Pemohon.</w:t>
+      </w:r>
+    </w:p>
+    <w:p>
+      <w:pPr>
+        <w:pStyle w:val="6"/>
+        <w:numPr>
+          <w:ilvl w:val="0"/>
+          <w:numId w:val="1"/>
+        </w:numPr>
+        <w:spacing w:line="240" w:lineRule="auto"/>
+        <w:ind w:left="360" w:leftChars="0" w:right="160" w:rightChars="0" w:hanging="280" w:firstLineChars="0"/>
+        <w:jc w:val="both"/>
+        <w:rPr>
+          <w:rFonts w:hint="default" w:ascii="Kalinga" w:hAnsi="Kalinga" w:cs="Kalinga"/>
+          <w:color w:val="auto"/>
+          <w:sz w:val="20"/>
+          <w:szCs w:val="20"/>
+          <w:lang w:val="en-US"/>
+        </w:rPr>
+      </w:pPr>
+      <w:r>
+        <w:rPr>
+          <w:rFonts w:hint="default" w:ascii="Kalinga" w:hAnsi="Kalinga" w:cs="Kalinga"/>
+          <w:color w:val="auto"/>
+          <w:sz w:val="20"/>
+          <w:szCs w:val="20"/>
+          <w:lang w:val="en-US"/>
+        </w:rPr>
+        <w:t>Biaya Propisi, Tata Laksana dan Biaya lainnya (apabila ada) agar di debet dari Rekening Afiliasi atas nama Pemohon.</w:t>
+      </w:r>
+      <w:r>
+        <w:rPr>
+          <w:rFonts w:hint="default" w:ascii="Kalinga" w:hAnsi="Kalinga"/>
+          <w:color w:val="auto"/>
+          <w:sz w:val="20"/>
+          <w:szCs w:val="20"/>
+          <w:lang w:val="en-US"/>
+        </w:rPr>
+        <w:t>{% for item in syarat_pencairan_list %}</w:t>
+      </w:r>
+    </w:p>
+    <w:p>
+      <w:pPr>
+        <w:pStyle w:val="6"/>
+        <w:numPr>
+          <w:ilvl w:val="0"/>
+          <w:numId w:val="1"/>
+        </w:numPr>
+        <w:spacing w:line="240" w:lineRule="auto"/>
+        <w:ind w:left="360" w:leftChars="0" w:right="160" w:rightChars="0" w:hanging="280" w:firstLineChars="0"/>
+        <w:jc w:val="both"/>
+        <w:rPr>
+          <w:rFonts w:hint="default" w:ascii="Kalinga" w:hAnsi="Kalinga"/>
+          <w:sz w:val="20"/>
+          <w:szCs w:val="20"/>
+        </w:rPr>
+      </w:pPr>
+      <w:r>
+        <w:rPr>
+          <w:rFonts w:hint="default" w:ascii="Kalinga" w:hAnsi="Kalinga"/>
+          <w:color w:val="auto"/>
+          <w:sz w:val="20"/>
+          <w:szCs w:val="20"/>
+          <w:lang w:val="en-US"/>
+        </w:rPr>
+        <w:t>{{ item }}.{% endfor %}</w:t>
+      </w:r>
+    </w:p>
+    <w:p>
+      <w:pPr>
+        <w:pStyle w:val="6"/>
+        <w:numPr>
+          <w:ilvl w:val="0"/>
+          <w:numId w:val="1"/>
+        </w:numPr>
+        <w:spacing w:line="240" w:lineRule="auto"/>
+        <w:ind w:left="360" w:leftChars="0" w:right="160" w:rightChars="0" w:hanging="280" w:firstLineChars="0"/>
+        <w:jc w:val="both"/>
+        <w:rPr>
+          <w:rFonts w:hint="default" w:ascii="Kalinga" w:hAnsi="Kalinga"/>
+          <w:sz w:val="20"/>
+          <w:szCs w:val="20"/>
+        </w:rPr>
+      </w:pPr>
+      <w:r>
+        <w:rPr>
+          <w:rFonts w:hint="default" w:ascii="Kalinga" w:hAnsi="Kalinga" w:cs="Kalinga"/>
+          <w:color w:val="auto"/>
+          <w:sz w:val="20"/>
+          <w:szCs w:val="20"/>
+          <w:lang w:val="en-US"/>
+        </w:rPr>
+        <w:t>Rekening BNI Taplus atas nama Pemohon yang telah dibuka sebelumnya yang dijadikan sebagai Rekening Afiliasi Kredit diblokir sebesar {{blokir_angsuran_total}} ({{blokir_angsuran_total_terbilang}}) kali angsuran, ({{blokir_angsuran_prapurna}} ({{blokir_angsuran_prapurna_terbilang}}) kali untuk Angsuran Masa Prapurna (dapat dibuka blokir setiap bulan untuk angsuran), ({{blokir_angsuran_pindah_gaji}} ({{blokir_angsuran_pindah_gaji_terbilang}}) kali angsuran untuk Perpindahan Gaji ke BNI (dapat dibuka setelah Gaji Pensiun tercermin di Rekening BNI) dan {{blokir_angsuran_lunas}} ({{blokir_angsuran_lunas_terbilang}}) kali Angsuran (pokok+ bunga) ditambah saldo minimum Taplus dibuka saat kredit lunas.</w:t>
+      </w:r>
+      <w:bookmarkStart w:id="54" w:name="_GoBack"/>
+      <w:bookmarkEnd w:id="54"/>
+      <w:r>
+        <w:rPr>
+          <w:rFonts w:hint="default" w:ascii="Kalinga" w:hAnsi="Kalinga"/>
+          <w:sz w:val="20"/>
+          <w:szCs w:val="20"/>
+        </w:rPr>
+        <w:t>{% if slik_bank_1_takeover == 'ya' %}</w:t>
+      </w:r>
+    </w:p>
+    <w:p>
+      <w:pPr>
+        <w:pStyle w:val="6"/>
+        <w:numPr>
+          <w:ilvl w:val="0"/>
+          <w:numId w:val="1"/>
+        </w:numPr>
+        <w:spacing w:line="240" w:lineRule="auto"/>
+        <w:ind w:left="360" w:leftChars="0" w:right="160" w:rightChars="0" w:hanging="280" w:firstLineChars="0"/>
+        <w:jc w:val="both"/>
+        <w:rPr>
+          <w:rFonts w:hint="default" w:ascii="Kalinga" w:hAnsi="Kalinga"/>
+          <w:sz w:val="20"/>
+          <w:szCs w:val="20"/>
+        </w:rPr>
+      </w:pPr>
+      <w:r>
+        <w:rPr>
+          <w:rFonts w:hint="default" w:ascii="Kalinga" w:hAnsi="Kalinga"/>
+          <w:sz w:val="20"/>
+          <w:szCs w:val="20"/>
+        </w:rPr>
+        <w:t>Dilakukan Pelunasan Fasilitas Kredit {{ slik_bank_1_jenis | default('', true) }} di {{ slik_bank_1_nama | default('', true) }} atas nama Pemohon sebesar nominal pelunasan.{% endif %}{% if slik_bank_2_takeover == 'ya' %}</w:t>
+      </w:r>
+    </w:p>
+    <w:p>
+      <w:pPr>
+        <w:pStyle w:val="6"/>
+        <w:numPr>
+          <w:ilvl w:val="0"/>
+          <w:numId w:val="1"/>
+        </w:numPr>
+        <w:spacing w:line="240" w:lineRule="auto"/>
+        <w:ind w:left="360" w:leftChars="0" w:right="160" w:rightChars="0" w:hanging="280" w:firstLineChars="0"/>
+        <w:jc w:val="both"/>
+        <w:rPr>
+          <w:rFonts w:hint="default" w:ascii="Kalinga" w:hAnsi="Kalinga"/>
+          <w:sz w:val="20"/>
+          <w:szCs w:val="20"/>
+        </w:rPr>
+      </w:pPr>
+      <w:r>
+        <w:rPr>
+          <w:rFonts w:hint="default" w:ascii="Kalinga" w:hAnsi="Kalinga"/>
+          <w:sz w:val="20"/>
+          <w:szCs w:val="20"/>
+        </w:rPr>
+        <w:t>Dilakukan Pelunasan Fasilitas Kredit {{ slik_bank_2_jenis | default('', true) }} di {{ slik_bank_2_nama | default('', true) }} atas nama Pemohon sebesar nominal pelunasan.{% endif %}{% if slik_bank_3_takeover == 'ya' %}</w:t>
+      </w:r>
+    </w:p>
+    <w:p>
+      <w:pPr>
+        <w:pStyle w:val="6"/>
+        <w:numPr>
+          <w:ilvl w:val="0"/>
+          <w:numId w:val="1"/>
+        </w:numPr>
+        <w:spacing w:line="240" w:lineRule="auto"/>
+        <w:ind w:left="360" w:leftChars="0" w:right="160" w:rightChars="0" w:hanging="280" w:firstLineChars="0"/>
+        <w:jc w:val="both"/>
+        <w:rPr>
+          <w:rFonts w:hint="default" w:ascii="Kalinga" w:hAnsi="Kalinga"/>
+          <w:sz w:val="20"/>
+          <w:szCs w:val="20"/>
+        </w:rPr>
+      </w:pPr>
+      <w:r>
+        <w:rPr>
+          <w:rFonts w:hint="default" w:ascii="Kalinga" w:hAnsi="Kalinga"/>
+          <w:sz w:val="20"/>
+          <w:szCs w:val="20"/>
+        </w:rPr>
+        <w:t>Dilakukan Pelunasan Fasilitas Kredit {{ slik_bank_3_jenis | default('', true) }} di {{ slik_bank_3_nama | default('', true) }} atas nama Pemohon sebesar nominal pelunasan.{% endif %}{% if slik_bank_4_takeover == 'ya' %}</w:t>
+      </w:r>
+    </w:p>
+    <w:p>
+      <w:pPr>
+        <w:pStyle w:val="6"/>
+        <w:numPr>
+          <w:ilvl w:val="0"/>
+          <w:numId w:val="1"/>
+        </w:numPr>
+        <w:spacing w:line="240" w:lineRule="auto"/>
+        <w:ind w:left="360" w:leftChars="0" w:right="160" w:rightChars="0" w:hanging="280" w:firstLineChars="0"/>
+        <w:jc w:val="both"/>
+        <w:rPr>
+          <w:rFonts w:hint="default" w:ascii="Kalinga" w:hAnsi="Kalinga"/>
+          <w:sz w:val="20"/>
+          <w:szCs w:val="20"/>
+        </w:rPr>
+      </w:pPr>
+      <w:r>
+        <w:rPr>
+          <w:rFonts w:hint="default" w:ascii="Kalinga" w:hAnsi="Kalinga"/>
+          <w:sz w:val="20"/>
+          <w:szCs w:val="20"/>
+        </w:rPr>
+        <w:t>Dilakukan Pelunasan Fasilitas Kredit {{ slik_bank_4_jenis | default('', true) }} di {{ slik_bank_4_nama | default('', true) }} atas nama Pemohon sebesar nominal pelunasan.{% endif %}{% if slik_bank_5_takeover == 'ya' %}</w:t>
+      </w:r>
+    </w:p>
+    <w:p>
+      <w:pPr>
+        <w:pStyle w:val="6"/>
+        <w:numPr>
+          <w:ilvl w:val="0"/>
+          <w:numId w:val="1"/>
+        </w:numPr>
+        <w:spacing w:line="240" w:lineRule="auto"/>
+        <w:ind w:left="360" w:leftChars="0" w:right="160" w:rightChars="0" w:hanging="280" w:firstLineChars="0"/>
+        <w:jc w:val="both"/>
+        <w:rPr>
+          <w:rFonts w:hint="default" w:ascii="Kalinga" w:hAnsi="Kalinga"/>
+          <w:sz w:val="20"/>
+          <w:szCs w:val="20"/>
+        </w:rPr>
+      </w:pPr>
+      <w:r>
+        <w:rPr>
+          <w:rFonts w:hint="default" w:ascii="Kalinga" w:hAnsi="Kalinga"/>
+          <w:sz w:val="20"/>
+          <w:szCs w:val="20"/>
+        </w:rPr>
+        <w:t>Dilakukan Pelunasan Fasilitas Kredit {{ slik_bank_5_jenis | default('', true) }} di {{ slik_bank_5_nama | default('', true) }} atas nama Pemohon sebesar nominal pelunasan.{% endif %}{% if slik_bank_6_takeover == 'ya' %}</w:t>
+      </w:r>
+    </w:p>
+    <w:p>
+      <w:pPr>
+        <w:pStyle w:val="6"/>
+        <w:numPr>
+          <w:ilvl w:val="0"/>
+          <w:numId w:val="1"/>
+        </w:numPr>
+        <w:spacing w:line="240" w:lineRule="auto"/>
+        <w:ind w:left="360" w:leftChars="0" w:right="160" w:rightChars="0" w:hanging="280" w:firstLineChars="0"/>
+        <w:jc w:val="both"/>
+        <w:rPr>
+          <w:rFonts w:hint="default" w:ascii="Kalinga" w:hAnsi="Kalinga"/>
+          <w:sz w:val="20"/>
+          <w:szCs w:val="20"/>
+        </w:rPr>
+      </w:pPr>
+      <w:r>
+        <w:rPr>
+          <w:rFonts w:hint="default" w:ascii="Kalinga" w:hAnsi="Kalinga"/>
+          <w:sz w:val="20"/>
+          <w:szCs w:val="20"/>
+        </w:rPr>
+        <w:t>Dilakukan Pelunasan Fasilitas Kredit {{ slik_bank_6_jenis | default('', true) }} di {{ slik_bank_6_nama | default('', true) }} atas nama Pemohon sebesar nominal pelunasan.{% endif %}{% if slik_bank_7_takeover == 'ya' %}</w:t>
+      </w:r>
+    </w:p>
+    <w:p>
+      <w:pPr>
+        <w:pStyle w:val="6"/>
+        <w:numPr>
+          <w:ilvl w:val="0"/>
+          <w:numId w:val="1"/>
+        </w:numPr>
+        <w:spacing w:line="240" w:lineRule="auto"/>
+        <w:ind w:left="360" w:leftChars="0" w:right="160" w:rightChars="0" w:hanging="280" w:firstLineChars="0"/>
+        <w:jc w:val="both"/>
+        <w:rPr>
+          <w:rFonts w:hint="default" w:ascii="Kalinga" w:hAnsi="Kalinga"/>
+          <w:sz w:val="20"/>
+          <w:szCs w:val="20"/>
+        </w:rPr>
+      </w:pPr>
+      <w:r>
+        <w:rPr>
+          <w:rFonts w:hint="default" w:ascii="Kalinga" w:hAnsi="Kalinga"/>
+          <w:sz w:val="20"/>
+          <w:szCs w:val="20"/>
+        </w:rPr>
+        <w:t>Dilakukan Pelunasan Fasilitas Kredit {{ slik_bank_7_jenis | default('', true) }} di {{ slik_bank_7_nama | default('', true) }} atas nama Pemohon sebesar nominal pelunasan.{% endif %}{% if slik_bank_8_takeover == 'ya' %}</w:t>
+      </w:r>
+    </w:p>
+    <w:p>
+      <w:pPr>
+        <w:pStyle w:val="6"/>
+        <w:numPr>
+          <w:ilvl w:val="0"/>
+          <w:numId w:val="1"/>
+        </w:numPr>
+        <w:spacing w:line="240" w:lineRule="auto"/>
+        <w:ind w:left="360" w:leftChars="0" w:right="160" w:rightChars="0" w:hanging="280" w:firstLineChars="0"/>
+        <w:jc w:val="both"/>
+        <w:rPr>
+          <w:rFonts w:hint="default" w:ascii="Kalinga" w:hAnsi="Kalinga"/>
+          <w:sz w:val="20"/>
+          <w:szCs w:val="20"/>
+        </w:rPr>
+      </w:pPr>
+      <w:r>
+        <w:rPr>
+          <w:rFonts w:hint="default" w:ascii="Kalinga" w:hAnsi="Kalinga"/>
+          <w:sz w:val="20"/>
+          <w:szCs w:val="20"/>
+        </w:rPr>
+        <w:t>Dilakukan Pelunasan Fasilitas Kredit {{ slik_bank_8_jenis | default('', true) }} di {{ slik_bank_8_nama | default('', true) }} atas nama Pemohon sebesar nominal pelunasan.{% endif %}{% if slik_bank_9_takeover == 'ya' %}</w:t>
+      </w:r>
+    </w:p>
+    <w:p>
+      <w:pPr>
+        <w:pStyle w:val="6"/>
+        <w:numPr>
+          <w:ilvl w:val="0"/>
+          <w:numId w:val="1"/>
+        </w:numPr>
+        <w:spacing w:line="240" w:lineRule="auto"/>
+        <w:ind w:left="360" w:leftChars="0" w:right="160" w:rightChars="0" w:hanging="280" w:firstLineChars="0"/>
+        <w:jc w:val="both"/>
+        <w:rPr>
+          <w:rFonts w:hint="default" w:ascii="Kalinga" w:hAnsi="Kalinga"/>
+          <w:sz w:val="20"/>
+          <w:szCs w:val="20"/>
+        </w:rPr>
+      </w:pPr>
+      <w:r>
+        <w:rPr>
+          <w:rFonts w:hint="default" w:ascii="Kalinga" w:hAnsi="Kalinga"/>
+          <w:sz w:val="20"/>
+          <w:szCs w:val="20"/>
+        </w:rPr>
+        <w:t>Dilakukan Pelunasan Fasilitas Kredit {{ slik_bank_9_jenis | default('', true) }} di {{ slik_bank_9_nama | default('', true) }} atas nama Pemohon sebesar nominal pelunasan.{% endif %}{% if slik_bank_10_takeover == 'ya' %}</w:t>
+      </w:r>
+    </w:p>
+    <w:p>
+      <w:pPr>
+        <w:pStyle w:val="6"/>
+        <w:numPr>
+          <w:ilvl w:val="0"/>
+          <w:numId w:val="1"/>
+        </w:numPr>
+        <w:spacing w:line="240" w:lineRule="auto"/>
+        <w:ind w:left="360" w:leftChars="0" w:right="160" w:rightChars="0" w:hanging="280" w:firstLineChars="0"/>
+        <w:jc w:val="both"/>
+        <w:rPr>
+          <w:rFonts w:hint="default" w:ascii="Kalinga" w:hAnsi="Kalinga"/>
+          <w:sz w:val="20"/>
+          <w:szCs w:val="20"/>
+        </w:rPr>
+      </w:pPr>
+      <w:r>
+        <w:rPr>
+          <w:rFonts w:hint="default" w:ascii="Kalinga" w:hAnsi="Kalinga"/>
+          <w:sz w:val="20"/>
+          <w:szCs w:val="20"/>
+        </w:rPr>
+        <w:t>Dilakukan Pelunasan Fasilitas Kredit {{ slik_bank_10_jenis | default('', true) }} di {{ slik_bank_10_nama | default('', true) }} atas nama Pemohon sebesar nominal pelunasan.{% endif %}{% if slik_bank_11_takeover == 'ya' %}</w:t>
+      </w:r>
+    </w:p>
+    <w:p>
+      <w:pPr>
+        <w:pStyle w:val="6"/>
+        <w:numPr>
+          <w:ilvl w:val="0"/>
+          <w:numId w:val="1"/>
+        </w:numPr>
+        <w:spacing w:line="240" w:lineRule="auto"/>
+        <w:ind w:left="360" w:leftChars="0" w:right="160" w:rightChars="0" w:hanging="280" w:firstLineChars="0"/>
+        <w:jc w:val="both"/>
+        <w:rPr>
+          <w:rFonts w:hint="default" w:ascii="Kalinga" w:hAnsi="Kalinga"/>
+          <w:sz w:val="20"/>
+          <w:szCs w:val="20"/>
+        </w:rPr>
+      </w:pPr>
+      <w:r>
+        <w:rPr>
+          <w:rFonts w:hint="default" w:ascii="Kalinga" w:hAnsi="Kalinga"/>
+          <w:sz w:val="20"/>
+          <w:szCs w:val="20"/>
+        </w:rPr>
+        <w:t>Dilakukan Pelunasan Fasilitas Kredit {{ slik_bank_11_jenis | default('', true) }} di {{ slik_bank_11_nama | default('', true) }} atas nama Pemohon sebesar nominal pelunasan.{% endif %}{% if slik_bank_12_takeover == 'ya' %}</w:t>
+      </w:r>
+    </w:p>
+    <w:p>
+      <w:pPr>
+        <w:pStyle w:val="6"/>
+        <w:numPr>
+          <w:ilvl w:val="0"/>
+          <w:numId w:val="1"/>
+        </w:numPr>
+        <w:spacing w:line="240" w:lineRule="auto"/>
+        <w:ind w:left="360" w:leftChars="0" w:right="160" w:rightChars="0" w:hanging="280" w:firstLineChars="0"/>
+        <w:jc w:val="both"/>
+        <w:rPr>
+          <w:rFonts w:hint="default" w:ascii="Kalinga" w:hAnsi="Kalinga"/>
+          <w:sz w:val="20"/>
+          <w:szCs w:val="20"/>
+        </w:rPr>
+      </w:pPr>
+      <w:r>
+        <w:rPr>
+          <w:rFonts w:hint="default" w:ascii="Kalinga" w:hAnsi="Kalinga"/>
+          <w:sz w:val="20"/>
+          <w:szCs w:val="20"/>
+        </w:rPr>
+        <w:t>Dilakukan Pelunasan Fasilitas Kredit {{ slik_bank_12_jenis | default('', true) }} di {{ slik_bank_12_nama | default('', true) }} atas nama Pemohon sebesar nominal pelunasan.{% endif %}{% if slik_bank_13_takeover == 'ya' %}</w:t>
+      </w:r>
+    </w:p>
+    <w:p>
+      <w:pPr>
+        <w:pStyle w:val="6"/>
+        <w:numPr>
+          <w:ilvl w:val="0"/>
+          <w:numId w:val="1"/>
+        </w:numPr>
+        <w:spacing w:line="240" w:lineRule="auto"/>
+        <w:ind w:left="360" w:leftChars="0" w:right="160" w:rightChars="0" w:hanging="280" w:firstLineChars="0"/>
+        <w:jc w:val="both"/>
+        <w:rPr>
+          <w:rFonts w:hint="default" w:ascii="Kalinga" w:hAnsi="Kalinga"/>
+          <w:sz w:val="20"/>
+          <w:szCs w:val="20"/>
+        </w:rPr>
+      </w:pPr>
+      <w:r>
+        <w:rPr>
+          <w:rFonts w:hint="default" w:ascii="Kalinga" w:hAnsi="Kalinga"/>
+          <w:sz w:val="20"/>
+          <w:szCs w:val="20"/>
+        </w:rPr>
+        <w:t>Dilakukan Pelunasan Fasilitas Kredit {{ slik_bank_13_jenis | default('', true) }} di {{ slik_bank_13_nama | default('', true) }} atas nama Pemohon sebesar nominal pelunasan.{% endif %}{% if slik_bank_14_takeover == 'ya' %}</w:t>
+      </w:r>
+    </w:p>
+    <w:p>
+      <w:pPr>
+        <w:pStyle w:val="6"/>
+        <w:numPr>
+          <w:ilvl w:val="0"/>
+          <w:numId w:val="1"/>
+        </w:numPr>
+        <w:spacing w:line="240" w:lineRule="auto"/>
+        <w:ind w:left="360" w:leftChars="0" w:right="160" w:rightChars="0" w:hanging="280" w:firstLineChars="0"/>
+        <w:jc w:val="both"/>
+        <w:rPr>
+          <w:rFonts w:hint="default" w:ascii="Kalinga" w:hAnsi="Kalinga"/>
+          <w:sz w:val="20"/>
+          <w:szCs w:val="20"/>
+        </w:rPr>
+      </w:pPr>
+      <w:r>
+        <w:rPr>
+          <w:rFonts w:hint="default" w:ascii="Kalinga" w:hAnsi="Kalinga"/>
+          <w:sz w:val="20"/>
+          <w:szCs w:val="20"/>
+        </w:rPr>
+        <w:t>Dilakukan Pelunasan Fasilitas Kredit {{ slik_bank_14_jenis | default('', true) }} di {{ slik_bank_14_nama | default('', true) }} atas nama Pemohon sebesar nominal pelunasan.{% endif %}{% if slik_bank_15_takeover == 'ya' %}</w:t>
+      </w:r>
+    </w:p>
+    <w:p>
+      <w:pPr>
+        <w:pStyle w:val="6"/>
+        <w:numPr>
+          <w:ilvl w:val="0"/>
+          <w:numId w:val="1"/>
+        </w:numPr>
+        <w:spacing w:line="240" w:lineRule="auto"/>
+        <w:ind w:left="360" w:leftChars="0" w:right="160" w:rightChars="0" w:hanging="280" w:firstLineChars="0"/>
+        <w:jc w:val="both"/>
+        <w:rPr>
+          <w:rFonts w:hint="default" w:ascii="Kalinga" w:hAnsi="Kalinga"/>
+          <w:sz w:val="20"/>
+          <w:szCs w:val="20"/>
+        </w:rPr>
+      </w:pPr>
+      <w:r>
+        <w:rPr>
+          <w:rFonts w:hint="default" w:ascii="Kalinga" w:hAnsi="Kalinga"/>
+          <w:sz w:val="20"/>
+          <w:szCs w:val="20"/>
+        </w:rPr>
+        <w:t>Dilakukan Pelunasan Fasilitas Kredit {{ slik_bank_15_jenis | default('', true) }} di {{ slik_bank_15_nama | default('', true) }} atas nama Pemohon sebesar nominal pelunasan.{% endif %}{% for item in syarat_pencairan_list %}</w:t>
+      </w:r>
+    </w:p>
+    <w:p>
+      <w:pPr>
+        <w:pStyle w:val="6"/>
+        <w:numPr>
+          <w:ilvl w:val="0"/>
+          <w:numId w:val="1"/>
+        </w:numPr>
+        <w:spacing w:line="240" w:lineRule="auto"/>
+        <w:ind w:left="360" w:leftChars="0" w:right="160" w:rightChars="0" w:hanging="280" w:firstLineChars="0"/>
+        <w:jc w:val="both"/>
+        <w:rPr>
+          <w:rFonts w:hint="default" w:ascii="Kalinga" w:hAnsi="Kalinga"/>
+          <w:sz w:val="20"/>
+          <w:szCs w:val="20"/>
+        </w:rPr>
+      </w:pPr>
+      <w:r>
+        <w:rPr>
+          <w:rFonts w:hint="default" w:ascii="Kalinga" w:hAnsi="Kalinga"/>
+          <w:sz w:val="20"/>
+          <w:szCs w:val="20"/>
+        </w:rPr>
+        <w:t xml:space="preserve">{{ item }}{% endfor %}  </w:t>
+      </w:r>
+    </w:p>
+    <w:p>
+      <w:pPr>
+        <w:pStyle w:val="6"/>
+        <w:numPr>
+          <w:ilvl w:val="0"/>
+          <w:numId w:val="1"/>
+        </w:numPr>
+        <w:spacing w:line="240" w:lineRule="auto"/>
+        <w:ind w:left="360" w:leftChars="0" w:right="160" w:rightChars="0" w:hanging="280" w:firstLineChars="0"/>
+        <w:jc w:val="both"/>
+        <w:rPr>
+          <w:rFonts w:hint="default" w:ascii="Kalinga" w:hAnsi="Kalinga"/>
+          <w:sz w:val="20"/>
+          <w:szCs w:val="20"/>
+        </w:rPr>
+      </w:pPr>
+      <w:r>
+        <w:rPr>
+          <w:rFonts w:hint="default" w:ascii="Kalinga" w:hAnsi="Kalinga"/>
+          <w:sz w:val="20"/>
+          <w:szCs w:val="20"/>
+        </w:rPr>
+        <w:t xml:space="preserve">Sisa pencairan dapat dilakukan setelah Bukti Lunas / Surat Keterangan Lunas dari {{ takeover_bank_list }} dan Asli SK Awal, Asli SK Akhir </w:t>
+      </w:r>
+      <w:r>
+        <w:rPr>
+          <w:rFonts w:hint="default" w:ascii="Kalinga" w:hAnsi="Kalinga"/>
+          <w:sz w:val="20"/>
+          <w:szCs w:val="20"/>
+          <w:lang w:val="en-US"/>
+        </w:rPr>
+        <w:t xml:space="preserve">serta </w:t>
+      </w:r>
+      <w:r>
+        <w:rPr>
+          <w:rFonts w:hint="default" w:ascii="Kalinga" w:hAnsi="Kalinga"/>
+          <w:sz w:val="20"/>
+          <w:szCs w:val="20"/>
+        </w:rPr>
+        <w:t>Kartu Taspen atas nama Pemohon di</w:t>
+      </w:r>
+      <w:r>
+        <w:rPr>
+          <w:rFonts w:hint="default" w:ascii="Kalinga" w:hAnsi="Kalinga"/>
+          <w:sz w:val="20"/>
+          <w:szCs w:val="20"/>
+          <w:lang w:val="en-US"/>
+        </w:rPr>
+        <w:t>s</w:t>
+      </w:r>
+      <w:r>
+        <w:rPr>
+          <w:rFonts w:hint="default" w:ascii="Kalinga" w:hAnsi="Kalinga"/>
+          <w:sz w:val="20"/>
+          <w:szCs w:val="20"/>
+        </w:rPr>
+        <w:t xml:space="preserve">erahkan ke BNI serta Proses Flagging Taspen di BNI telah dijalankan dan semua persyaratan kredit telah terpenuhi </w:t>
+      </w:r>
+    </w:p>
+    <w:p>
+      <w:pPr>
+        <w:pStyle w:val="6"/>
+        <w:numPr>
+          <w:ilvl w:val="0"/>
+          <w:numId w:val="1"/>
+        </w:numPr>
+        <w:spacing w:line="240" w:lineRule="auto"/>
+        <w:ind w:left="360" w:leftChars="0" w:right="160" w:rightChars="0" w:hanging="280" w:firstLineChars="0"/>
+        <w:jc w:val="both"/>
+        <w:rPr>
+          <w:rFonts w:ascii="Kalinga" w:hAnsi="Kalinga" w:cs="Kalinga"/>
+          <w:sz w:val="20"/>
+          <w:szCs w:val="20"/>
+        </w:rPr>
+      </w:pPr>
+      <w:r>
+        <w:rPr>
+          <w:rFonts w:hint="default" w:ascii="Kalinga" w:hAnsi="Kalinga"/>
+          <w:sz w:val="20"/>
+          <w:szCs w:val="20"/>
+        </w:rPr>
+        <w:t>Lainnya Cfm. Ketentuan BNI Fleksi Pensiun dan ketentuan yang berlaku.</w:t>
+      </w:r>
+      <w:bookmarkEnd w:id="45"/>
       <w:bookmarkEnd w:id="47"/>
-      <w:bookmarkEnd w:id="54"/>
-      <w:r>
-        <w:rPr>
-          <w:rFonts w:hint="default" w:ascii="Kalinga" w:hAnsi="Kalinga"/>
-          <w:sz w:val="20"/>
-          <w:szCs w:val="20"/>
-        </w:rPr>
-        <w:t>encairan Kredit dengan Maksimum Kredit sebesar Rp. {{ usulan_plafon_kredit | default('0', true) }},- dilakukan secara sekaligus ke Rekening Pemohon.{% if slik_bank_1_takeover == 'ya' %}</w:t>
-      </w:r>
-    </w:p>
-    <w:p>
-      <w:pPr>
-        <w:pStyle w:val="6"/>
-        <w:numPr>
-          <w:ilvl w:val="0"/>
-          <w:numId w:val="1"/>
-        </w:numPr>
-        <w:spacing w:line="240" w:lineRule="auto"/>
-        <w:ind w:left="360" w:leftChars="0" w:right="160" w:rightChars="0" w:hanging="280" w:firstLineChars="0"/>
-        <w:jc w:val="both"/>
-        <w:rPr>
-          <w:rFonts w:hint="default" w:ascii="Kalinga" w:hAnsi="Kalinga"/>
-          <w:sz w:val="20"/>
-          <w:szCs w:val="20"/>
-        </w:rPr>
-      </w:pPr>
-      <w:r>
-        <w:rPr>
-          <w:rFonts w:hint="default" w:ascii="Kalinga" w:hAnsi="Kalinga"/>
-          <w:sz w:val="20"/>
-          <w:szCs w:val="20"/>
-        </w:rPr>
-        <w:t>Dilakukan Pelunasan Fasilitas Kredit {{ slik_bank_1_jenis | default('', true) }} di {{ slik_bank_1_nama | default('', true) }} atas nama Pemohon sebesar nominal pelunasan.{% endif %}{% if slik_bank_2_takeover == 'ya' %}</w:t>
-      </w:r>
-    </w:p>
-    <w:p>
-      <w:pPr>
-        <w:pStyle w:val="6"/>
-        <w:numPr>
-          <w:ilvl w:val="0"/>
-          <w:numId w:val="1"/>
-        </w:numPr>
-        <w:spacing w:line="240" w:lineRule="auto"/>
-        <w:ind w:left="360" w:leftChars="0" w:right="160" w:rightChars="0" w:hanging="280" w:firstLineChars="0"/>
-        <w:jc w:val="both"/>
-        <w:rPr>
-          <w:rFonts w:hint="default" w:ascii="Kalinga" w:hAnsi="Kalinga"/>
-          <w:sz w:val="20"/>
-          <w:szCs w:val="20"/>
-        </w:rPr>
-      </w:pPr>
-      <w:r>
-        <w:rPr>
-          <w:rFonts w:hint="default" w:ascii="Kalinga" w:hAnsi="Kalinga"/>
-          <w:sz w:val="20"/>
-          <w:szCs w:val="20"/>
-        </w:rPr>
-        <w:t>Dilakukan Pelunasan Fasilitas Kredit {{ slik_bank_2_jenis | default('', true) }} di {{ slik_bank_2_nama | default('', true) }} atas nama Pemohon sebesar nominal pelunasan.{% endif %}{% if slik_bank_3_takeover == 'ya' %}</w:t>
-      </w:r>
-    </w:p>
-    <w:p>
-      <w:pPr>
-        <w:pStyle w:val="6"/>
-        <w:numPr>
-          <w:ilvl w:val="0"/>
-          <w:numId w:val="1"/>
-        </w:numPr>
-        <w:spacing w:line="240" w:lineRule="auto"/>
-        <w:ind w:left="360" w:leftChars="0" w:right="160" w:rightChars="0" w:hanging="280" w:firstLineChars="0"/>
-        <w:jc w:val="both"/>
-        <w:rPr>
-          <w:rFonts w:hint="default" w:ascii="Kalinga" w:hAnsi="Kalinga"/>
-          <w:sz w:val="20"/>
-          <w:szCs w:val="20"/>
-        </w:rPr>
-      </w:pPr>
-      <w:r>
-        <w:rPr>
-          <w:rFonts w:hint="default" w:ascii="Kalinga" w:hAnsi="Kalinga"/>
-          <w:sz w:val="20"/>
-          <w:szCs w:val="20"/>
-        </w:rPr>
-        <w:t>Dilakukan Pelunasan Fasilitas Kredit {{ slik_bank_3_jenis | default('', true) }} di {{ slik_bank_3_nama | default('', true) }} atas nama Pemohon sebesar nominal pelunasan.{% endif %}{% if slik_bank_4_takeover == 'ya' %}</w:t>
-      </w:r>
-    </w:p>
-    <w:p>
-      <w:pPr>
-        <w:pStyle w:val="6"/>
-        <w:numPr>
-          <w:ilvl w:val="0"/>
-          <w:numId w:val="1"/>
-        </w:numPr>
-        <w:spacing w:line="240" w:lineRule="auto"/>
-        <w:ind w:left="360" w:leftChars="0" w:right="160" w:rightChars="0" w:hanging="280" w:firstLineChars="0"/>
-        <w:jc w:val="both"/>
-        <w:rPr>
-          <w:rFonts w:hint="default" w:ascii="Kalinga" w:hAnsi="Kalinga"/>
-          <w:sz w:val="20"/>
-          <w:szCs w:val="20"/>
-        </w:rPr>
-      </w:pPr>
-      <w:r>
-        <w:rPr>
-          <w:rFonts w:hint="default" w:ascii="Kalinga" w:hAnsi="Kalinga"/>
-          <w:sz w:val="20"/>
-          <w:szCs w:val="20"/>
-        </w:rPr>
-        <w:t>Dilakukan Pelunasan Fasilitas Kredit {{ slik_bank_4_jenis | default('', true) }} di {{ slik_bank_4_nama | default('', true) }} atas nama Pemohon sebesar nominal pelunasan.{% endif %}{% if slik_bank_5_takeover == 'ya' %}</w:t>
-      </w:r>
-    </w:p>
-    <w:p>
-      <w:pPr>
-        <w:pStyle w:val="6"/>
-        <w:numPr>
-          <w:ilvl w:val="0"/>
-          <w:numId w:val="1"/>
-        </w:numPr>
-        <w:spacing w:line="240" w:lineRule="auto"/>
-        <w:ind w:left="360" w:leftChars="0" w:right="160" w:rightChars="0" w:hanging="280" w:firstLineChars="0"/>
-        <w:jc w:val="both"/>
-        <w:rPr>
-          <w:rFonts w:hint="default" w:ascii="Kalinga" w:hAnsi="Kalinga"/>
-          <w:sz w:val="20"/>
-          <w:szCs w:val="20"/>
-        </w:rPr>
-      </w:pPr>
-      <w:r>
-        <w:rPr>
-          <w:rFonts w:hint="default" w:ascii="Kalinga" w:hAnsi="Kalinga"/>
-          <w:sz w:val="20"/>
-          <w:szCs w:val="20"/>
-        </w:rPr>
-        <w:t>Dilakukan Pelunasan Fasilitas Kredit {{ slik_bank_5_jenis | default('', true) }} di {{ slik_bank_5_nama | default('', true) }} atas nama Pemohon sebesar nominal pelunasan.{% endif %}{% if slik_bank_6_takeover == 'ya' %}</w:t>
-      </w:r>
-    </w:p>
-    <w:p>
-      <w:pPr>
-        <w:pStyle w:val="6"/>
-        <w:numPr>
-          <w:ilvl w:val="0"/>
-          <w:numId w:val="1"/>
-        </w:numPr>
-        <w:spacing w:line="240" w:lineRule="auto"/>
-        <w:ind w:left="360" w:leftChars="0" w:right="160" w:rightChars="0" w:hanging="280" w:firstLineChars="0"/>
-        <w:jc w:val="both"/>
-        <w:rPr>
-          <w:rFonts w:hint="default" w:ascii="Kalinga" w:hAnsi="Kalinga"/>
-          <w:sz w:val="20"/>
-          <w:szCs w:val="20"/>
-        </w:rPr>
-      </w:pPr>
-      <w:r>
-        <w:rPr>
-          <w:rFonts w:hint="default" w:ascii="Kalinga" w:hAnsi="Kalinga"/>
-          <w:sz w:val="20"/>
-          <w:szCs w:val="20"/>
-        </w:rPr>
-        <w:t>Dilakukan Pelunasan Fasilitas Kredit {{ slik_bank_6_jenis | default('', true) }} di {{ slik_bank_6_nama | default('', true) }} atas nama Pemohon sebesar nominal pelunasan.{% endif %}{% if slik_bank_7_takeover == 'ya' %}</w:t>
-      </w:r>
-    </w:p>
-    <w:p>
-      <w:pPr>
-        <w:pStyle w:val="6"/>
-        <w:numPr>
-          <w:ilvl w:val="0"/>
-          <w:numId w:val="1"/>
-        </w:numPr>
-        <w:spacing w:line="240" w:lineRule="auto"/>
-        <w:ind w:left="360" w:leftChars="0" w:right="160" w:rightChars="0" w:hanging="280" w:firstLineChars="0"/>
-        <w:jc w:val="both"/>
-        <w:rPr>
-          <w:rFonts w:hint="default" w:ascii="Kalinga" w:hAnsi="Kalinga"/>
-          <w:sz w:val="20"/>
-          <w:szCs w:val="20"/>
-        </w:rPr>
-      </w:pPr>
-      <w:r>
-        <w:rPr>
-          <w:rFonts w:hint="default" w:ascii="Kalinga" w:hAnsi="Kalinga"/>
-          <w:sz w:val="20"/>
-          <w:szCs w:val="20"/>
-        </w:rPr>
-        <w:t>Dilakukan Pelunasan Fasilitas Kredit {{ slik_bank_7_jenis | default('', true) }} di {{ slik_bank_7_nama | default('', true) }} atas nama Pemohon sebesar nominal pelunasan.{% endif %}{% if slik_bank_8_takeover == 'ya' %}</w:t>
-      </w:r>
-    </w:p>
-    <w:p>
-      <w:pPr>
-        <w:pStyle w:val="6"/>
-        <w:numPr>
-          <w:ilvl w:val="0"/>
-          <w:numId w:val="1"/>
-        </w:numPr>
-        <w:spacing w:line="240" w:lineRule="auto"/>
-        <w:ind w:left="360" w:leftChars="0" w:right="160" w:rightChars="0" w:hanging="280" w:firstLineChars="0"/>
-        <w:jc w:val="both"/>
-        <w:rPr>
-          <w:rFonts w:hint="default" w:ascii="Kalinga" w:hAnsi="Kalinga"/>
-          <w:sz w:val="20"/>
-          <w:szCs w:val="20"/>
-        </w:rPr>
-      </w:pPr>
-      <w:r>
-        <w:rPr>
-          <w:rFonts w:hint="default" w:ascii="Kalinga" w:hAnsi="Kalinga"/>
-          <w:sz w:val="20"/>
-          <w:szCs w:val="20"/>
-        </w:rPr>
-        <w:t>Dilakukan Pelunasan Fasilitas Kredit {{ slik_bank_8_jenis | default('', true) }} di {{ slik_bank_8_nama | default('', true) }} atas nama Pemohon sebesar nominal pelunasan.{% endif %}{% if slik_bank_9_takeover == 'ya' %}</w:t>
-      </w:r>
-    </w:p>
-    <w:p>
-      <w:pPr>
-        <w:pStyle w:val="6"/>
-        <w:numPr>
-          <w:ilvl w:val="0"/>
-          <w:numId w:val="1"/>
-        </w:numPr>
-        <w:spacing w:line="240" w:lineRule="auto"/>
-        <w:ind w:left="360" w:leftChars="0" w:right="160" w:rightChars="0" w:hanging="280" w:firstLineChars="0"/>
-        <w:jc w:val="both"/>
-        <w:rPr>
-          <w:rFonts w:hint="default" w:ascii="Kalinga" w:hAnsi="Kalinga"/>
-          <w:sz w:val="20"/>
-          <w:szCs w:val="20"/>
-        </w:rPr>
-      </w:pPr>
-      <w:r>
-        <w:rPr>
-          <w:rFonts w:hint="default" w:ascii="Kalinga" w:hAnsi="Kalinga"/>
-          <w:sz w:val="20"/>
-          <w:szCs w:val="20"/>
-        </w:rPr>
-        <w:t>Dilakukan Pelunasan Fasilitas Kredit {{ slik_bank_9_jenis | default('', true) }} di {{ slik_bank_9_nama | default('', true) }} atas nama Pemohon sebesar nominal pelunasan.{% endif %}{% if slik_bank_10_takeover == 'ya' %}</w:t>
-      </w:r>
-    </w:p>
-    <w:p>
-      <w:pPr>
-        <w:pStyle w:val="6"/>
-        <w:numPr>
-          <w:ilvl w:val="0"/>
-          <w:numId w:val="1"/>
-        </w:numPr>
-        <w:spacing w:line="240" w:lineRule="auto"/>
-        <w:ind w:left="360" w:leftChars="0" w:right="160" w:rightChars="0" w:hanging="280" w:firstLineChars="0"/>
-        <w:jc w:val="both"/>
-        <w:rPr>
-          <w:rFonts w:hint="default" w:ascii="Kalinga" w:hAnsi="Kalinga"/>
-          <w:sz w:val="20"/>
-          <w:szCs w:val="20"/>
-        </w:rPr>
-      </w:pPr>
-      <w:r>
-        <w:rPr>
-          <w:rFonts w:hint="default" w:ascii="Kalinga" w:hAnsi="Kalinga"/>
-          <w:sz w:val="20"/>
-          <w:szCs w:val="20"/>
-        </w:rPr>
-        <w:t>Dilakukan Pelunasan Fasilitas Kredit {{ slik_bank_10_jenis | default('', true) }} di {{ slik_bank_10_nama | default('', true) }} atas nama Pemohon sebesar nominal pelunasan.{% endif %}{% if slik_bank_11_takeover == 'ya' %}</w:t>
-      </w:r>
-    </w:p>
-    <w:p>
-      <w:pPr>
-        <w:pStyle w:val="6"/>
-        <w:numPr>
-          <w:ilvl w:val="0"/>
-          <w:numId w:val="1"/>
-        </w:numPr>
-        <w:spacing w:line="240" w:lineRule="auto"/>
-        <w:ind w:left="360" w:leftChars="0" w:right="160" w:rightChars="0" w:hanging="280" w:firstLineChars="0"/>
-        <w:jc w:val="both"/>
-        <w:rPr>
-          <w:rFonts w:hint="default" w:ascii="Kalinga" w:hAnsi="Kalinga"/>
-          <w:sz w:val="20"/>
-          <w:szCs w:val="20"/>
-        </w:rPr>
-      </w:pPr>
-      <w:r>
-        <w:rPr>
-          <w:rFonts w:hint="default" w:ascii="Kalinga" w:hAnsi="Kalinga"/>
-          <w:sz w:val="20"/>
-          <w:szCs w:val="20"/>
-        </w:rPr>
-        <w:t>Dilakukan Pelunasan Fasilitas Kredit {{ slik_bank_11_jenis | default('', true) }} di {{ slik_bank_11_nama | default('', true) }} atas nama Pemohon sebesar nominal pelunasan.{% endif %}{% if slik_bank_12_takeover == 'ya' %}</w:t>
-      </w:r>
-    </w:p>
-    <w:p>
-      <w:pPr>
-        <w:pStyle w:val="6"/>
-        <w:numPr>
-          <w:ilvl w:val="0"/>
-          <w:numId w:val="1"/>
-        </w:numPr>
-        <w:spacing w:line="240" w:lineRule="auto"/>
-        <w:ind w:left="360" w:leftChars="0" w:right="160" w:rightChars="0" w:hanging="280" w:firstLineChars="0"/>
-        <w:jc w:val="both"/>
-        <w:rPr>
-          <w:rFonts w:hint="default" w:ascii="Kalinga" w:hAnsi="Kalinga"/>
-          <w:sz w:val="20"/>
-          <w:szCs w:val="20"/>
-        </w:rPr>
-      </w:pPr>
-      <w:r>
-        <w:rPr>
-          <w:rFonts w:hint="default" w:ascii="Kalinga" w:hAnsi="Kalinga"/>
-          <w:sz w:val="20"/>
-          <w:szCs w:val="20"/>
-        </w:rPr>
-        <w:t>Dilakukan Pelunasan Fasilitas Kredit {{ slik_bank_12_jenis | default('', true) }} di {{ slik_bank_12_nama | default('', true) }} atas nama Pemohon sebesar nominal pelunasan.{% endif %}{% if slik_bank_13_takeover == 'ya' %}</w:t>
-      </w:r>
-    </w:p>
-    <w:p>
-      <w:pPr>
-        <w:pStyle w:val="6"/>
-        <w:numPr>
-          <w:ilvl w:val="0"/>
-          <w:numId w:val="1"/>
-        </w:numPr>
-        <w:spacing w:line="240" w:lineRule="auto"/>
-        <w:ind w:left="360" w:leftChars="0" w:right="160" w:rightChars="0" w:hanging="280" w:firstLineChars="0"/>
-        <w:jc w:val="both"/>
-        <w:rPr>
-          <w:rFonts w:hint="default" w:ascii="Kalinga" w:hAnsi="Kalinga"/>
-          <w:sz w:val="20"/>
-          <w:szCs w:val="20"/>
-        </w:rPr>
-      </w:pPr>
-      <w:r>
-        <w:rPr>
-          <w:rFonts w:hint="default" w:ascii="Kalinga" w:hAnsi="Kalinga"/>
-          <w:sz w:val="20"/>
-          <w:szCs w:val="20"/>
-        </w:rPr>
-        <w:t>Dilakukan Pelunasan Fasilitas Kredit {{ slik_bank_13_jenis | default('', true) }} di {{ slik_bank_13_nama | default('', true) }} atas nama Pemohon sebesar nominal pelunasan.{% endif %}{% if slik_bank_14_takeover == 'ya' %}</w:t>
-      </w:r>
-    </w:p>
-    <w:p>
-      <w:pPr>
-        <w:pStyle w:val="6"/>
-        <w:numPr>
-          <w:ilvl w:val="0"/>
-          <w:numId w:val="1"/>
-        </w:numPr>
-        <w:spacing w:line="240" w:lineRule="auto"/>
-        <w:ind w:left="360" w:leftChars="0" w:right="160" w:rightChars="0" w:hanging="280" w:firstLineChars="0"/>
-        <w:jc w:val="both"/>
-        <w:rPr>
-          <w:rFonts w:hint="default" w:ascii="Kalinga" w:hAnsi="Kalinga"/>
-          <w:sz w:val="20"/>
-          <w:szCs w:val="20"/>
-        </w:rPr>
-      </w:pPr>
-      <w:r>
-        <w:rPr>
-          <w:rFonts w:hint="default" w:ascii="Kalinga" w:hAnsi="Kalinga"/>
-          <w:sz w:val="20"/>
-          <w:szCs w:val="20"/>
-        </w:rPr>
-        <w:t>Dilakukan Pelunasan Fasilitas Kredit {{ slik_bank_14_jenis | default('', true) }} di {{ slik_bank_14_nama | default('', true) }} atas nama Pemohon sebesar nominal pelunasan.{% endif %}{% if slik_bank_15_takeover == 'ya' %}</w:t>
-      </w:r>
-    </w:p>
-    <w:p>
-      <w:pPr>
-        <w:pStyle w:val="6"/>
-        <w:numPr>
-          <w:ilvl w:val="0"/>
-          <w:numId w:val="1"/>
-        </w:numPr>
-        <w:spacing w:line="240" w:lineRule="auto"/>
-        <w:ind w:left="360" w:leftChars="0" w:right="160" w:rightChars="0" w:hanging="280" w:firstLineChars="0"/>
-        <w:jc w:val="both"/>
-        <w:rPr>
-          <w:rFonts w:hint="default" w:ascii="Kalinga" w:hAnsi="Kalinga"/>
-          <w:sz w:val="20"/>
-          <w:szCs w:val="20"/>
-        </w:rPr>
-      </w:pPr>
-      <w:r>
-        <w:rPr>
-          <w:rFonts w:hint="default" w:ascii="Kalinga" w:hAnsi="Kalinga"/>
-          <w:sz w:val="20"/>
-          <w:szCs w:val="20"/>
-        </w:rPr>
-        <w:t>Dilakukan Pelunasan Fasilitas Kredit {{ slik_bank_15_jenis | default('', true) }} di {{ slik_bank_15_nama | default('', true) }} atas nama Pemohon sebesar nominal pelunasan.{% endif %}{% for item in syarat_pencairan_list %}</w:t>
-      </w:r>
-    </w:p>
-    <w:p>
-      <w:pPr>
-        <w:pStyle w:val="6"/>
-        <w:numPr>
-          <w:ilvl w:val="0"/>
-          <w:numId w:val="1"/>
-        </w:numPr>
-        <w:spacing w:line="240" w:lineRule="auto"/>
-        <w:ind w:left="360" w:leftChars="0" w:right="160" w:rightChars="0" w:hanging="280" w:firstLineChars="0"/>
-        <w:jc w:val="both"/>
-        <w:rPr>
-          <w:rFonts w:hint="default" w:ascii="Kalinga" w:hAnsi="Kalinga"/>
-          <w:sz w:val="20"/>
-          <w:szCs w:val="20"/>
-        </w:rPr>
-      </w:pPr>
-      <w:r>
-        <w:rPr>
-          <w:rFonts w:hint="default" w:ascii="Kalinga" w:hAnsi="Kalinga"/>
-          <w:sz w:val="20"/>
-          <w:szCs w:val="20"/>
-        </w:rPr>
-        <w:t xml:space="preserve">{{ item }}{% endfor %}  </w:t>
-      </w:r>
-    </w:p>
-    <w:p>
-      <w:pPr>
-        <w:pStyle w:val="6"/>
-        <w:numPr>
-          <w:ilvl w:val="0"/>
-          <w:numId w:val="1"/>
-        </w:numPr>
-        <w:spacing w:line="240" w:lineRule="auto"/>
-        <w:ind w:left="360" w:leftChars="0" w:right="160" w:rightChars="0" w:hanging="280" w:firstLineChars="0"/>
-        <w:jc w:val="both"/>
-        <w:rPr>
-          <w:rFonts w:hint="default" w:ascii="Kalinga" w:hAnsi="Kalinga"/>
-          <w:sz w:val="20"/>
-          <w:szCs w:val="20"/>
-        </w:rPr>
-      </w:pPr>
-      <w:r>
-        <w:rPr>
-          <w:rFonts w:hint="default" w:ascii="Kalinga" w:hAnsi="Kalinga"/>
-          <w:sz w:val="20"/>
-          <w:szCs w:val="20"/>
-        </w:rPr>
-        <w:t xml:space="preserve">Sisa pencairan dapat dilakukan setelah Bukti Lunas / Surat Keterangan Lunas dari {{ takeover_bank_list }} dan Asli SK Awal, Asli SK Akhir </w:t>
-      </w:r>
-      <w:r>
-        <w:rPr>
-          <w:rFonts w:hint="default" w:ascii="Kalinga" w:hAnsi="Kalinga"/>
-          <w:sz w:val="20"/>
-          <w:szCs w:val="20"/>
-          <w:lang w:val="en-US"/>
-        </w:rPr>
-        <w:t xml:space="preserve">serta </w:t>
-      </w:r>
-      <w:r>
-        <w:rPr>
-          <w:rFonts w:hint="default" w:ascii="Kalinga" w:hAnsi="Kalinga"/>
-          <w:sz w:val="20"/>
-          <w:szCs w:val="20"/>
-        </w:rPr>
-        <w:t>Kartu Taspen atas nama Pemohon di</w:t>
-      </w:r>
-      <w:r>
-        <w:rPr>
-          <w:rFonts w:hint="default" w:ascii="Kalinga" w:hAnsi="Kalinga"/>
-          <w:sz w:val="20"/>
-          <w:szCs w:val="20"/>
-          <w:lang w:val="en-US"/>
-        </w:rPr>
-        <w:t>s</w:t>
-      </w:r>
-      <w:r>
-        <w:rPr>
-          <w:rFonts w:hint="default" w:ascii="Kalinga" w:hAnsi="Kalinga"/>
-          <w:sz w:val="20"/>
-          <w:szCs w:val="20"/>
-        </w:rPr>
-        <w:t xml:space="preserve">erahkan ke BNI serta Proses Flagging Taspen di BNI telah dijalankan dan semua persyaratan kredit telah terpenuhi </w:t>
-      </w:r>
-    </w:p>
-    <w:p>
-      <w:pPr>
-        <w:pStyle w:val="6"/>
-        <w:numPr>
-          <w:ilvl w:val="0"/>
-          <w:numId w:val="1"/>
-        </w:numPr>
-        <w:spacing w:line="240" w:lineRule="auto"/>
-        <w:ind w:left="360" w:leftChars="0" w:right="160" w:rightChars="0" w:hanging="280" w:firstLineChars="0"/>
-        <w:jc w:val="both"/>
-        <w:rPr>
-          <w:rFonts w:ascii="Kalinga" w:hAnsi="Kalinga" w:cs="Kalinga"/>
-          <w:sz w:val="20"/>
-          <w:szCs w:val="20"/>
-        </w:rPr>
-      </w:pPr>
-      <w:r>
-        <w:rPr>
-          <w:rFonts w:hint="default" w:ascii="Kalinga" w:hAnsi="Kalinga"/>
-          <w:sz w:val="20"/>
-          <w:szCs w:val="20"/>
-        </w:rPr>
-        <w:t>Lainnya Cfm. Ketentuan BNI Fleksi Pensiun dan ketentuan yang berlaku.</w:t>
-      </w:r>
-      <w:bookmarkEnd w:id="45"/>
       <w:bookmarkEnd w:id="48"/>
       <w:bookmarkEnd w:id="49"/>
       <w:bookmarkEnd w:id="50"/>
       <w:bookmarkEnd w:id="51"/>
       <w:bookmarkEnd w:id="52"/>
-      <w:bookmarkEnd w:id="53"/>
     </w:p>
     <w:sectPr>
       <w:pgSz w:w="12240" w:h="15840"/>

</xml_diff>